<commit_message>
docs: fix version number in SDS
</commit_message>
<xml_diff>
--- a/docs/sds.docx
+++ b/docs/sds.docx
@@ -703,8 +703,10 @@
               <w:rPr>
                 <w:b/>
               </w:rPr>
-              <w:t>1.0</w:t>
-            </w:r>
+              <w:t>0.3.0</w:t>
+            </w:r>
+            <w:bookmarkStart w:id="0" w:name="_GoBack"/>
+            <w:bookmarkEnd w:id="0"/>
           </w:p>
         </w:tc>
       </w:tr>
@@ -2166,7 +2168,7 @@
     </w:p>
     <w:tbl>
       <w:tblPr>
-        <w:tblStyle w:val="TableGrid"/>
+        <w:tblStyle w:val="PlainTable1"/>
         <w:tblW w:w="0" w:type="auto"/>
         <w:tblLook w:val="04A0" w:firstRow="1" w:lastRow="0" w:firstColumn="1" w:lastColumn="0" w:noHBand="0" w:noVBand="1"/>
       </w:tblPr>
@@ -2177,22 +2179,23 @@
       </w:tblGrid>
       <w:tr>
         <w:trPr>
+          <w:cnfStyle w:val="100000000000" w:firstRow="1" w:lastRow="0" w:firstColumn="0" w:lastColumn="0" w:oddVBand="0" w:evenVBand="0" w:oddHBand="0" w:evenHBand="0" w:firstRowFirstColumn="0" w:firstRowLastColumn="0" w:lastRowFirstColumn="0" w:lastRowLastColumn="0"/>
           <w:trHeight w:val="566"/>
         </w:trPr>
         <w:tc>
           <w:tcPr>
+            <w:cnfStyle w:val="001000000000" w:firstRow="0" w:lastRow="0" w:firstColumn="1" w:lastColumn="0" w:oddVBand="0" w:evenVBand="0" w:oddHBand="0" w:evenHBand="0" w:firstRowFirstColumn="0" w:firstRowLastColumn="0" w:lastRowFirstColumn="0" w:lastRowLastColumn="0"/>
             <w:tcW w:w="2065" w:type="dxa"/>
           </w:tcPr>
           <w:p>
             <w:pPr>
               <w:rPr>
-                <w:b/>
-                <w:szCs w:val="28"/>
-              </w:rPr>
-            </w:pPr>
-            <w:r>
-              <w:rPr>
-                <w:b/>
+                <w:b w:val="0"/>
+                <w:szCs w:val="28"/>
+              </w:rPr>
+            </w:pPr>
+            <w:r>
+              <w:rPr>
                 <w:szCs w:val="28"/>
               </w:rPr>
               <w:t>Attribute</w:t>
@@ -2205,14 +2208,14 @@
           </w:tcPr>
           <w:p>
             <w:pPr>
-              <w:rPr>
-                <w:b/>
-                <w:szCs w:val="28"/>
-              </w:rPr>
-            </w:pPr>
-            <w:r>
-              <w:rPr>
-                <w:b/>
+              <w:cnfStyle w:val="100000000000" w:firstRow="1" w:lastRow="0" w:firstColumn="0" w:lastColumn="0" w:oddVBand="0" w:evenVBand="0" w:oddHBand="0" w:evenHBand="0" w:firstRowFirstColumn="0" w:firstRowLastColumn="0" w:lastRowFirstColumn="0" w:lastRowLastColumn="0"/>
+              <w:rPr>
+                <w:b w:val="0"/>
+                <w:szCs w:val="28"/>
+              </w:rPr>
+            </w:pPr>
+            <w:r>
+              <w:rPr>
                 <w:szCs w:val="28"/>
               </w:rPr>
               <w:t>Type</w:t>
@@ -2225,14 +2228,14 @@
           </w:tcPr>
           <w:p>
             <w:pPr>
-              <w:rPr>
-                <w:b/>
-                <w:szCs w:val="28"/>
-              </w:rPr>
-            </w:pPr>
-            <w:r>
-              <w:rPr>
-                <w:b/>
+              <w:cnfStyle w:val="100000000000" w:firstRow="1" w:lastRow="0" w:firstColumn="0" w:lastColumn="0" w:oddVBand="0" w:evenVBand="0" w:oddHBand="0" w:evenHBand="0" w:firstRowFirstColumn="0" w:firstRowLastColumn="0" w:lastRowFirstColumn="0" w:lastRowLastColumn="0"/>
+              <w:rPr>
+                <w:b w:val="0"/>
+                <w:szCs w:val="28"/>
+              </w:rPr>
+            </w:pPr>
+            <w:r>
+              <w:rPr>
                 <w:szCs w:val="28"/>
               </w:rPr>
               <w:t>Description</w:t>
@@ -2242,16 +2245,17 @@
       </w:tr>
       <w:tr>
         <w:trPr>
+          <w:cnfStyle w:val="000000100000" w:firstRow="0" w:lastRow="0" w:firstColumn="0" w:lastColumn="0" w:oddVBand="0" w:evenVBand="0" w:oddHBand="1" w:evenHBand="0" w:firstRowFirstColumn="0" w:firstRowLastColumn="0" w:lastRowFirstColumn="0" w:lastRowLastColumn="0"/>
           <w:trHeight w:val="458"/>
         </w:trPr>
         <w:tc>
           <w:tcPr>
+            <w:cnfStyle w:val="001000000000" w:firstRow="0" w:lastRow="0" w:firstColumn="1" w:lastColumn="0" w:oddVBand="0" w:evenVBand="0" w:oddHBand="0" w:evenHBand="0" w:firstRowFirstColumn="0" w:firstRowLastColumn="0" w:lastRowFirstColumn="0" w:lastRowLastColumn="0"/>
             <w:tcW w:w="2065" w:type="dxa"/>
           </w:tcPr>
           <w:p>
             <w:pPr>
               <w:rPr>
-                <w:b/>
                 <w:sz w:val="28"/>
                 <w:szCs w:val="28"/>
               </w:rPr>
@@ -2259,7 +2263,6 @@
             <w:proofErr w:type="spellStart"/>
             <w:r>
               <w:rPr>
-                <w:b/>
                 <w:sz w:val="28"/>
                 <w:szCs w:val="28"/>
               </w:rPr>
@@ -2275,6 +2278,7 @@
           <w:p>
             <w:pPr>
               <w:jc w:val="center"/>
+              <w:cnfStyle w:val="000000100000" w:firstRow="0" w:lastRow="0" w:firstColumn="0" w:lastColumn="0" w:oddVBand="0" w:evenVBand="0" w:oddHBand="1" w:evenHBand="0" w:firstRowFirstColumn="0" w:firstRowLastColumn="0" w:lastRowFirstColumn="0" w:lastRowLastColumn="0"/>
               <w:rPr>
                 <w:szCs w:val="28"/>
               </w:rPr>
@@ -2293,6 +2297,7 @@
           </w:tcPr>
           <w:p>
             <w:pPr>
+              <w:cnfStyle w:val="000000100000" w:firstRow="0" w:lastRow="0" w:firstColumn="0" w:lastColumn="0" w:oddVBand="0" w:evenVBand="0" w:oddHBand="1" w:evenHBand="0" w:firstRowFirstColumn="0" w:firstRowLastColumn="0" w:lastRowFirstColumn="0" w:lastRowLastColumn="0"/>
               <w:rPr>
                 <w:b/>
               </w:rPr>
@@ -2306,19 +2311,18 @@
       <w:tr>
         <w:tc>
           <w:tcPr>
+            <w:cnfStyle w:val="001000000000" w:firstRow="0" w:lastRow="0" w:firstColumn="1" w:lastColumn="0" w:oddVBand="0" w:evenVBand="0" w:oddHBand="0" w:evenHBand="0" w:firstRowFirstColumn="0" w:firstRowLastColumn="0" w:lastRowFirstColumn="0" w:lastRowLastColumn="0"/>
             <w:tcW w:w="2065" w:type="dxa"/>
           </w:tcPr>
           <w:p>
             <w:pPr>
               <w:rPr>
-                <w:b/>
                 <w:sz w:val="28"/>
                 <w:szCs w:val="28"/>
               </w:rPr>
             </w:pPr>
             <w:r>
               <w:rPr>
-                <w:b/>
                 <w:sz w:val="28"/>
                 <w:szCs w:val="28"/>
               </w:rPr>
@@ -2333,6 +2337,7 @@
           <w:p>
             <w:pPr>
               <w:jc w:val="center"/>
+              <w:cnfStyle w:val="000000000000" w:firstRow="0" w:lastRow="0" w:firstColumn="0" w:lastColumn="0" w:oddVBand="0" w:evenVBand="0" w:oddHBand="0" w:evenHBand="0" w:firstRowFirstColumn="0" w:firstRowLastColumn="0" w:lastRowFirstColumn="0" w:lastRowLastColumn="0"/>
               <w:rPr>
                 <w:szCs w:val="28"/>
               </w:rPr>
@@ -2351,6 +2356,7 @@
           </w:tcPr>
           <w:p>
             <w:pPr>
+              <w:cnfStyle w:val="000000000000" w:firstRow="0" w:lastRow="0" w:firstColumn="0" w:lastColumn="0" w:oddVBand="0" w:evenVBand="0" w:oddHBand="0" w:evenHBand="0" w:firstRowFirstColumn="0" w:firstRowLastColumn="0" w:lastRowFirstColumn="0" w:lastRowLastColumn="0"/>
               <w:rPr>
                 <w:b/>
               </w:rPr>
@@ -2362,14 +2368,17 @@
         </w:tc>
       </w:tr>
       <w:tr>
-        <w:tc>
-          <w:tcPr>
+        <w:trPr>
+          <w:cnfStyle w:val="000000100000" w:firstRow="0" w:lastRow="0" w:firstColumn="0" w:lastColumn="0" w:oddVBand="0" w:evenVBand="0" w:oddHBand="1" w:evenHBand="0" w:firstRowFirstColumn="0" w:firstRowLastColumn="0" w:lastRowFirstColumn="0" w:lastRowLastColumn="0"/>
+        </w:trPr>
+        <w:tc>
+          <w:tcPr>
+            <w:cnfStyle w:val="001000000000" w:firstRow="0" w:lastRow="0" w:firstColumn="1" w:lastColumn="0" w:oddVBand="0" w:evenVBand="0" w:oddHBand="0" w:evenHBand="0" w:firstRowFirstColumn="0" w:firstRowLastColumn="0" w:lastRowFirstColumn="0" w:lastRowLastColumn="0"/>
             <w:tcW w:w="2065" w:type="dxa"/>
           </w:tcPr>
           <w:p>
             <w:pPr>
               <w:rPr>
-                <w:b/>
                 <w:sz w:val="28"/>
                 <w:szCs w:val="28"/>
               </w:rPr>
@@ -2377,7 +2386,6 @@
             <w:proofErr w:type="spellStart"/>
             <w:r>
               <w:rPr>
-                <w:b/>
                 <w:sz w:val="28"/>
                 <w:szCs w:val="28"/>
               </w:rPr>
@@ -2393,6 +2401,7 @@
           <w:p>
             <w:pPr>
               <w:jc w:val="center"/>
+              <w:cnfStyle w:val="000000100000" w:firstRow="0" w:lastRow="0" w:firstColumn="0" w:lastColumn="0" w:oddVBand="0" w:evenVBand="0" w:oddHBand="1" w:evenHBand="0" w:firstRowFirstColumn="0" w:firstRowLastColumn="0" w:lastRowFirstColumn="0" w:lastRowLastColumn="0"/>
               <w:rPr>
                 <w:szCs w:val="28"/>
               </w:rPr>
@@ -2413,6 +2422,7 @@
           </w:tcPr>
           <w:p>
             <w:pPr>
+              <w:cnfStyle w:val="000000100000" w:firstRow="0" w:lastRow="0" w:firstColumn="0" w:lastColumn="0" w:oddVBand="0" w:evenVBand="0" w:oddHBand="1" w:evenHBand="0" w:firstRowFirstColumn="0" w:firstRowLastColumn="0" w:lastRowFirstColumn="0" w:lastRowLastColumn="0"/>
               <w:rPr>
                 <w:b/>
               </w:rPr>
@@ -2426,19 +2436,18 @@
       <w:tr>
         <w:tc>
           <w:tcPr>
+            <w:cnfStyle w:val="001000000000" w:firstRow="0" w:lastRow="0" w:firstColumn="1" w:lastColumn="0" w:oddVBand="0" w:evenVBand="0" w:oddHBand="0" w:evenHBand="0" w:firstRowFirstColumn="0" w:firstRowLastColumn="0" w:lastRowFirstColumn="0" w:lastRowLastColumn="0"/>
             <w:tcW w:w="2065" w:type="dxa"/>
           </w:tcPr>
           <w:p>
             <w:pPr>
               <w:rPr>
-                <w:b/>
                 <w:sz w:val="28"/>
                 <w:szCs w:val="28"/>
               </w:rPr>
             </w:pPr>
             <w:r>
               <w:rPr>
-                <w:b/>
                 <w:sz w:val="28"/>
                 <w:szCs w:val="28"/>
               </w:rPr>
@@ -2453,6 +2462,7 @@
           <w:p>
             <w:pPr>
               <w:jc w:val="center"/>
+              <w:cnfStyle w:val="000000000000" w:firstRow="0" w:lastRow="0" w:firstColumn="0" w:lastColumn="0" w:oddVBand="0" w:evenVBand="0" w:oddHBand="0" w:evenHBand="0" w:firstRowFirstColumn="0" w:firstRowLastColumn="0" w:lastRowFirstColumn="0" w:lastRowLastColumn="0"/>
               <w:rPr>
                 <w:szCs w:val="28"/>
               </w:rPr>
@@ -2471,6 +2481,7 @@
           </w:tcPr>
           <w:p>
             <w:pPr>
+              <w:cnfStyle w:val="000000000000" w:firstRow="0" w:lastRow="0" w:firstColumn="0" w:lastColumn="0" w:oddVBand="0" w:evenVBand="0" w:oddHBand="0" w:evenHBand="0" w:firstRowFirstColumn="0" w:firstRowLastColumn="0" w:lastRowFirstColumn="0" w:lastRowLastColumn="0"/>
               <w:rPr>
                 <w:b/>
               </w:rPr>
@@ -2482,14 +2493,17 @@
         </w:tc>
       </w:tr>
       <w:tr>
-        <w:tc>
-          <w:tcPr>
+        <w:trPr>
+          <w:cnfStyle w:val="000000100000" w:firstRow="0" w:lastRow="0" w:firstColumn="0" w:lastColumn="0" w:oddVBand="0" w:evenVBand="0" w:oddHBand="1" w:evenHBand="0" w:firstRowFirstColumn="0" w:firstRowLastColumn="0" w:lastRowFirstColumn="0" w:lastRowLastColumn="0"/>
+        </w:trPr>
+        <w:tc>
+          <w:tcPr>
+            <w:cnfStyle w:val="001000000000" w:firstRow="0" w:lastRow="0" w:firstColumn="1" w:lastColumn="0" w:oddVBand="0" w:evenVBand="0" w:oddHBand="0" w:evenHBand="0" w:firstRowFirstColumn="0" w:firstRowLastColumn="0" w:lastRowFirstColumn="0" w:lastRowLastColumn="0"/>
             <w:tcW w:w="2065" w:type="dxa"/>
           </w:tcPr>
           <w:p>
             <w:pPr>
               <w:rPr>
-                <w:b/>
                 <w:sz w:val="28"/>
                 <w:szCs w:val="28"/>
               </w:rPr>
@@ -2497,7 +2511,6 @@
             <w:proofErr w:type="spellStart"/>
             <w:r>
               <w:rPr>
-                <w:b/>
                 <w:sz w:val="28"/>
                 <w:szCs w:val="28"/>
               </w:rPr>
@@ -2513,6 +2526,7 @@
           <w:p>
             <w:pPr>
               <w:jc w:val="center"/>
+              <w:cnfStyle w:val="000000100000" w:firstRow="0" w:lastRow="0" w:firstColumn="0" w:lastColumn="0" w:oddVBand="0" w:evenVBand="0" w:oddHBand="1" w:evenHBand="0" w:firstRowFirstColumn="0" w:firstRowLastColumn="0" w:lastRowFirstColumn="0" w:lastRowLastColumn="0"/>
               <w:rPr>
                 <w:szCs w:val="28"/>
               </w:rPr>
@@ -2531,6 +2545,7 @@
           </w:tcPr>
           <w:p>
             <w:pPr>
+              <w:cnfStyle w:val="000000100000" w:firstRow="0" w:lastRow="0" w:firstColumn="0" w:lastColumn="0" w:oddVBand="0" w:evenVBand="0" w:oddHBand="1" w:evenHBand="0" w:firstRowFirstColumn="0" w:firstRowLastColumn="0" w:lastRowFirstColumn="0" w:lastRowLastColumn="0"/>
               <w:rPr>
                 <w:b/>
               </w:rPr>
@@ -2544,12 +2559,12 @@
       <w:tr>
         <w:tc>
           <w:tcPr>
+            <w:cnfStyle w:val="001000000000" w:firstRow="0" w:lastRow="0" w:firstColumn="1" w:lastColumn="0" w:oddVBand="0" w:evenVBand="0" w:oddHBand="0" w:evenHBand="0" w:firstRowFirstColumn="0" w:firstRowLastColumn="0" w:lastRowFirstColumn="0" w:lastRowLastColumn="0"/>
             <w:tcW w:w="2065" w:type="dxa"/>
           </w:tcPr>
           <w:p>
             <w:pPr>
               <w:rPr>
-                <w:b/>
                 <w:sz w:val="28"/>
                 <w:szCs w:val="28"/>
               </w:rPr>
@@ -2557,7 +2572,6 @@
             <w:proofErr w:type="spellStart"/>
             <w:r>
               <w:rPr>
-                <w:b/>
                 <w:sz w:val="28"/>
                 <w:szCs w:val="28"/>
               </w:rPr>
@@ -2573,6 +2587,7 @@
           <w:p>
             <w:pPr>
               <w:jc w:val="center"/>
+              <w:cnfStyle w:val="000000000000" w:firstRow="0" w:lastRow="0" w:firstColumn="0" w:lastColumn="0" w:oddVBand="0" w:evenVBand="0" w:oddHBand="0" w:evenHBand="0" w:firstRowFirstColumn="0" w:firstRowLastColumn="0" w:lastRowFirstColumn="0" w:lastRowLastColumn="0"/>
               <w:rPr>
                 <w:szCs w:val="28"/>
               </w:rPr>
@@ -2591,6 +2606,7 @@
           </w:tcPr>
           <w:p>
             <w:pPr>
+              <w:cnfStyle w:val="000000000000" w:firstRow="0" w:lastRow="0" w:firstColumn="0" w:lastColumn="0" w:oddVBand="0" w:evenVBand="0" w:oddHBand="0" w:evenHBand="0" w:firstRowFirstColumn="0" w:firstRowLastColumn="0" w:lastRowFirstColumn="0" w:lastRowLastColumn="0"/>
               <w:rPr>
                 <w:b/>
               </w:rPr>
@@ -2643,23 +2659,114 @@
     </w:p>
     <w:tbl>
       <w:tblPr>
-        <w:tblStyle w:val="TableGrid"/>
+        <w:tblStyle w:val="PlainTable1"/>
         <w:tblW w:w="0" w:type="auto"/>
-        <w:tblInd w:w="-5" w:type="dxa"/>
         <w:tblLook w:val="04A0" w:firstRow="1" w:lastRow="0" w:firstColumn="1" w:lastColumn="0" w:noHBand="0" w:noVBand="1"/>
       </w:tblPr>
       <w:tblGrid>
         <w:gridCol w:w="2160"/>
         <w:gridCol w:w="1440"/>
-        <w:gridCol w:w="5755"/>
+        <w:gridCol w:w="5750"/>
       </w:tblGrid>
       <w:tr>
-        <w:tc>
-          <w:tcPr>
+        <w:trPr>
+          <w:cnfStyle w:val="100000000000" w:firstRow="1" w:lastRow="0" w:firstColumn="0" w:lastColumn="0" w:oddVBand="0" w:evenVBand="0" w:oddHBand="0" w:evenHBand="0" w:firstRowFirstColumn="0" w:firstRowLastColumn="0" w:lastRowFirstColumn="0" w:lastRowLastColumn="0"/>
+        </w:trPr>
+        <w:tc>
+          <w:tcPr>
+            <w:cnfStyle w:val="001000000000" w:firstRow="0" w:lastRow="0" w:firstColumn="1" w:lastColumn="0" w:oddVBand="0" w:evenVBand="0" w:oddHBand="0" w:evenHBand="0" w:firstRowFirstColumn="0" w:firstRowLastColumn="0" w:lastRowFirstColumn="0" w:lastRowLastColumn="0"/>
             <w:tcW w:w="2160" w:type="dxa"/>
           </w:tcPr>
           <w:p>
             <w:pPr>
+              <w:rPr>
+                <w:b w:val="0"/>
+                <w:sz w:val="28"/>
+                <w:szCs w:val="28"/>
+              </w:rPr>
+            </w:pPr>
+            <w:r>
+              <w:rPr>
+                <w:szCs w:val="28"/>
+              </w:rPr>
+              <w:t>Attribute</w:t>
+            </w:r>
+          </w:p>
+        </w:tc>
+        <w:tc>
+          <w:tcPr>
+            <w:tcW w:w="1440" w:type="dxa"/>
+          </w:tcPr>
+          <w:p>
+            <w:pPr>
+              <w:cnfStyle w:val="100000000000" w:firstRow="1" w:lastRow="0" w:firstColumn="0" w:lastColumn="0" w:oddVBand="0" w:evenVBand="0" w:oddHBand="0" w:evenHBand="0" w:firstRowFirstColumn="0" w:firstRowLastColumn="0" w:lastRowFirstColumn="0" w:lastRowLastColumn="0"/>
+              <w:rPr>
+                <w:b w:val="0"/>
+                <w:sz w:val="28"/>
+                <w:szCs w:val="28"/>
+              </w:rPr>
+            </w:pPr>
+            <w:r>
+              <w:rPr>
+                <w:szCs w:val="28"/>
+              </w:rPr>
+              <w:t>Type</w:t>
+            </w:r>
+          </w:p>
+        </w:tc>
+        <w:tc>
+          <w:tcPr>
+            <w:tcW w:w="5755" w:type="dxa"/>
+          </w:tcPr>
+          <w:p>
+            <w:pPr>
+              <w:cnfStyle w:val="100000000000" w:firstRow="1" w:lastRow="0" w:firstColumn="0" w:lastColumn="0" w:oddVBand="0" w:evenVBand="0" w:oddHBand="0" w:evenHBand="0" w:firstRowFirstColumn="0" w:firstRowLastColumn="0" w:lastRowFirstColumn="0" w:lastRowLastColumn="0"/>
+              <w:rPr>
+                <w:b w:val="0"/>
+                <w:sz w:val="28"/>
+                <w:szCs w:val="28"/>
+              </w:rPr>
+            </w:pPr>
+            <w:r>
+              <w:rPr>
+                <w:szCs w:val="28"/>
+              </w:rPr>
+              <w:t>Description</w:t>
+            </w:r>
+          </w:p>
+        </w:tc>
+      </w:tr>
+      <w:tr>
+        <w:trPr>
+          <w:cnfStyle w:val="000000100000" w:firstRow="0" w:lastRow="0" w:firstColumn="0" w:lastColumn="0" w:oddVBand="0" w:evenVBand="0" w:oddHBand="1" w:evenHBand="0" w:firstRowFirstColumn="0" w:firstRowLastColumn="0" w:lastRowFirstColumn="0" w:lastRowLastColumn="0"/>
+        </w:trPr>
+        <w:tc>
+          <w:tcPr>
+            <w:cnfStyle w:val="001000000000" w:firstRow="0" w:lastRow="0" w:firstColumn="1" w:lastColumn="0" w:oddVBand="0" w:evenVBand="0" w:oddHBand="0" w:evenHBand="0" w:firstRowFirstColumn="0" w:firstRowLastColumn="0" w:lastRowFirstColumn="0" w:lastRowLastColumn="0"/>
+            <w:tcW w:w="2160" w:type="dxa"/>
+          </w:tcPr>
+          <w:p>
+            <w:pPr>
+              <w:rPr>
+                <w:b w:val="0"/>
+                <w:sz w:val="28"/>
+                <w:szCs w:val="28"/>
+              </w:rPr>
+            </w:pPr>
+            <w:proofErr w:type="spellStart"/>
+            <w:r>
+              <w:t>lot_id</w:t>
+            </w:r>
+            <w:proofErr w:type="spellEnd"/>
+          </w:p>
+        </w:tc>
+        <w:tc>
+          <w:tcPr>
+            <w:tcW w:w="1440" w:type="dxa"/>
+          </w:tcPr>
+          <w:p>
+            <w:pPr>
+              <w:cnfStyle w:val="000000100000" w:firstRow="0" w:lastRow="0" w:firstColumn="0" w:lastColumn="0" w:oddVBand="0" w:evenVBand="0" w:oddHBand="1" w:evenHBand="0" w:firstRowFirstColumn="0" w:firstRowLastColumn="0" w:lastRowFirstColumn="0" w:lastRowLastColumn="0"/>
               <w:rPr>
                 <w:b/>
                 <w:sz w:val="28"/>
@@ -2667,20 +2774,17 @@
               </w:rPr>
             </w:pPr>
             <w:r>
-              <w:rPr>
-                <w:b/>
-                <w:szCs w:val="28"/>
-              </w:rPr>
-              <w:t>Attribute</w:t>
-            </w:r>
-          </w:p>
-        </w:tc>
-        <w:tc>
-          <w:tcPr>
-            <w:tcW w:w="1440" w:type="dxa"/>
-          </w:tcPr>
-          <w:p>
-            <w:pPr>
+              <w:t>UUID</w:t>
+            </w:r>
+          </w:p>
+        </w:tc>
+        <w:tc>
+          <w:tcPr>
+            <w:tcW w:w="5755" w:type="dxa"/>
+          </w:tcPr>
+          <w:p>
+            <w:pPr>
+              <w:cnfStyle w:val="000000100000" w:firstRow="0" w:lastRow="0" w:firstColumn="0" w:lastColumn="0" w:oddVBand="0" w:evenVBand="0" w:oddHBand="1" w:evenHBand="0" w:firstRowFirstColumn="0" w:firstRowLastColumn="0" w:lastRowFirstColumn="0" w:lastRowLastColumn="0"/>
               <w:rPr>
                 <w:b/>
                 <w:sz w:val="28"/>
@@ -2688,20 +2792,39 @@
               </w:rPr>
             </w:pPr>
             <w:r>
-              <w:rPr>
-                <w:b/>
-                <w:szCs w:val="28"/>
-              </w:rPr>
-              <w:t>Type</w:t>
-            </w:r>
-          </w:p>
-        </w:tc>
-        <w:tc>
-          <w:tcPr>
-            <w:tcW w:w="5755" w:type="dxa"/>
-          </w:tcPr>
-          <w:p>
-            <w:pPr>
+              <w:t>Unique identifier for the specific purchase lot.</w:t>
+            </w:r>
+          </w:p>
+        </w:tc>
+      </w:tr>
+      <w:tr>
+        <w:tc>
+          <w:tcPr>
+            <w:cnfStyle w:val="001000000000" w:firstRow="0" w:lastRow="0" w:firstColumn="1" w:lastColumn="0" w:oddVBand="0" w:evenVBand="0" w:oddHBand="0" w:evenHBand="0" w:firstRowFirstColumn="0" w:firstRowLastColumn="0" w:lastRowFirstColumn="0" w:lastRowLastColumn="0"/>
+            <w:tcW w:w="2160" w:type="dxa"/>
+          </w:tcPr>
+          <w:p>
+            <w:pPr>
+              <w:rPr>
+                <w:b w:val="0"/>
+                <w:sz w:val="28"/>
+                <w:szCs w:val="28"/>
+              </w:rPr>
+            </w:pPr>
+            <w:proofErr w:type="spellStart"/>
+            <w:r>
+              <w:t>purchase_trade_id</w:t>
+            </w:r>
+            <w:proofErr w:type="spellEnd"/>
+          </w:p>
+        </w:tc>
+        <w:tc>
+          <w:tcPr>
+            <w:tcW w:w="1440" w:type="dxa"/>
+          </w:tcPr>
+          <w:p>
+            <w:pPr>
+              <w:cnfStyle w:val="000000000000" w:firstRow="0" w:lastRow="0" w:firstColumn="0" w:lastColumn="0" w:oddVBand="0" w:evenVBand="0" w:oddHBand="0" w:evenHBand="0" w:firstRowFirstColumn="0" w:firstRowLastColumn="0" w:lastRowFirstColumn="0" w:lastRowLastColumn="0"/>
               <w:rPr>
                 <w:b/>
                 <w:sz w:val="28"/>
@@ -2709,41 +2832,78 @@
               </w:rPr>
             </w:pPr>
             <w:r>
+              <w:t>UUID</w:t>
+            </w:r>
+          </w:p>
+        </w:tc>
+        <w:tc>
+          <w:tcPr>
+            <w:tcW w:w="5755" w:type="dxa"/>
+          </w:tcPr>
+          <w:p>
+            <w:pPr>
+              <w:cnfStyle w:val="000000000000" w:firstRow="0" w:lastRow="0" w:firstColumn="0" w:lastColumn="0" w:oddVBand="0" w:evenVBand="0" w:oddHBand="0" w:evenHBand="0" w:firstRowFirstColumn="0" w:firstRowLastColumn="0" w:lastRowFirstColumn="0" w:lastRowLastColumn="0"/>
               <w:rPr>
                 <w:b/>
-                <w:szCs w:val="28"/>
-              </w:rPr>
-              <w:t>Description</w:t>
+                <w:sz w:val="28"/>
+                <w:szCs w:val="28"/>
+              </w:rPr>
+            </w:pPr>
+            <w:r>
+              <w:t>Reference to the original "BUY" trade.</w:t>
             </w:r>
           </w:p>
         </w:tc>
       </w:tr>
       <w:tr>
-        <w:tc>
-          <w:tcPr>
+        <w:trPr>
+          <w:cnfStyle w:val="000000100000" w:firstRow="0" w:lastRow="0" w:firstColumn="0" w:lastColumn="0" w:oddVBand="0" w:evenVBand="0" w:oddHBand="1" w:evenHBand="0" w:firstRowFirstColumn="0" w:firstRowLastColumn="0" w:lastRowFirstColumn="0" w:lastRowLastColumn="0"/>
+        </w:trPr>
+        <w:tc>
+          <w:tcPr>
+            <w:cnfStyle w:val="001000000000" w:firstRow="0" w:lastRow="0" w:firstColumn="1" w:lastColumn="0" w:oddVBand="0" w:evenVBand="0" w:oddHBand="0" w:evenHBand="0" w:firstRowFirstColumn="0" w:firstRowLastColumn="0" w:lastRowFirstColumn="0" w:lastRowLastColumn="0"/>
             <w:tcW w:w="2160" w:type="dxa"/>
           </w:tcPr>
           <w:p>
             <w:pPr>
+              <w:rPr>
+                <w:b w:val="0"/>
+                <w:sz w:val="28"/>
+                <w:szCs w:val="28"/>
+              </w:rPr>
+            </w:pPr>
+            <w:proofErr w:type="spellStart"/>
+            <w:r>
+              <w:t>remaining_qty</w:t>
+            </w:r>
+            <w:proofErr w:type="spellEnd"/>
+          </w:p>
+        </w:tc>
+        <w:tc>
+          <w:tcPr>
+            <w:tcW w:w="1440" w:type="dxa"/>
+          </w:tcPr>
+          <w:p>
+            <w:pPr>
+              <w:cnfStyle w:val="000000100000" w:firstRow="0" w:lastRow="0" w:firstColumn="0" w:lastColumn="0" w:oddVBand="0" w:evenVBand="0" w:oddHBand="1" w:evenHBand="0" w:firstRowFirstColumn="0" w:firstRowLastColumn="0" w:lastRowFirstColumn="0" w:lastRowLastColumn="0"/>
               <w:rPr>
                 <w:b/>
                 <w:sz w:val="28"/>
                 <w:szCs w:val="28"/>
               </w:rPr>
             </w:pPr>
-            <w:proofErr w:type="spellStart"/>
-            <w:r>
-              <w:t>lot_id</w:t>
-            </w:r>
-            <w:proofErr w:type="spellEnd"/>
-          </w:p>
-        </w:tc>
-        <w:tc>
-          <w:tcPr>
-            <w:tcW w:w="1440" w:type="dxa"/>
-          </w:tcPr>
-          <w:p>
-            <w:pPr>
+            <w:r>
+              <w:t>Decimal</w:t>
+            </w:r>
+          </w:p>
+        </w:tc>
+        <w:tc>
+          <w:tcPr>
+            <w:tcW w:w="5755" w:type="dxa"/>
+          </w:tcPr>
+          <w:p>
+            <w:pPr>
+              <w:cnfStyle w:val="000000100000" w:firstRow="0" w:lastRow="0" w:firstColumn="0" w:lastColumn="0" w:oddVBand="0" w:evenVBand="0" w:oddHBand="1" w:evenHBand="0" w:firstRowFirstColumn="0" w:firstRowLastColumn="0" w:lastRowFirstColumn="0" w:lastRowLastColumn="0"/>
               <w:rPr>
                 <w:b/>
                 <w:sz w:val="28"/>
@@ -2751,16 +2911,39 @@
               </w:rPr>
             </w:pPr>
             <w:r>
-              <w:t>UUID</w:t>
-            </w:r>
-          </w:p>
-        </w:tc>
-        <w:tc>
-          <w:tcPr>
-            <w:tcW w:w="5755" w:type="dxa"/>
-          </w:tcPr>
-          <w:p>
-            <w:pPr>
+              <w:t>Shares currently available for future matching.</w:t>
+            </w:r>
+          </w:p>
+        </w:tc>
+      </w:tr>
+      <w:tr>
+        <w:tc>
+          <w:tcPr>
+            <w:cnfStyle w:val="001000000000" w:firstRow="0" w:lastRow="0" w:firstColumn="1" w:lastColumn="0" w:oddVBand="0" w:evenVBand="0" w:oddHBand="0" w:evenHBand="0" w:firstRowFirstColumn="0" w:firstRowLastColumn="0" w:lastRowFirstColumn="0" w:lastRowLastColumn="0"/>
+            <w:tcW w:w="2160" w:type="dxa"/>
+          </w:tcPr>
+          <w:p>
+            <w:pPr>
+              <w:rPr>
+                <w:b w:val="0"/>
+                <w:sz w:val="28"/>
+                <w:szCs w:val="28"/>
+              </w:rPr>
+            </w:pPr>
+            <w:proofErr w:type="spellStart"/>
+            <w:r>
+              <w:t>cost_basis_tl</w:t>
+            </w:r>
+            <w:proofErr w:type="spellEnd"/>
+          </w:p>
+        </w:tc>
+        <w:tc>
+          <w:tcPr>
+            <w:tcW w:w="1440" w:type="dxa"/>
+          </w:tcPr>
+          <w:p>
+            <w:pPr>
+              <w:cnfStyle w:val="000000000000" w:firstRow="0" w:lastRow="0" w:firstColumn="0" w:lastColumn="0" w:oddVBand="0" w:evenVBand="0" w:oddHBand="0" w:evenHBand="0" w:firstRowFirstColumn="0" w:firstRowLastColumn="0" w:lastRowFirstColumn="0" w:lastRowLastColumn="0"/>
               <w:rPr>
                 <w:b/>
                 <w:sz w:val="28"/>
@@ -2768,45 +2951,68 @@
               </w:rPr>
             </w:pPr>
             <w:r>
-              <w:t>Unique identifier for the specific purchase lot.</w:t>
+              <w:t>Decimal</w:t>
+            </w:r>
+          </w:p>
+        </w:tc>
+        <w:tc>
+          <w:tcPr>
+            <w:tcW w:w="5755" w:type="dxa"/>
+          </w:tcPr>
+          <w:p>
+            <w:pPr>
+              <w:cnfStyle w:val="000000000000" w:firstRow="0" w:lastRow="0" w:firstColumn="0" w:lastColumn="0" w:oddVBand="0" w:evenVBand="0" w:oddHBand="0" w:evenHBand="0" w:firstRowFirstColumn="0" w:firstRowLastColumn="0" w:lastRowFirstColumn="0" w:lastRowLastColumn="0"/>
+              <w:rPr>
+                <w:b/>
+                <w:sz w:val="28"/>
+                <w:szCs w:val="28"/>
+              </w:rPr>
+            </w:pPr>
+            <w:r>
+              <w:t>The total cost in TRY, calculated at the time of purchase.</w:t>
             </w:r>
           </w:p>
         </w:tc>
       </w:tr>
       <w:tr>
-        <w:tc>
-          <w:tcPr>
+        <w:trPr>
+          <w:cnfStyle w:val="000000100000" w:firstRow="0" w:lastRow="0" w:firstColumn="0" w:lastColumn="0" w:oddVBand="0" w:evenVBand="0" w:oddHBand="1" w:evenHBand="0" w:firstRowFirstColumn="0" w:firstRowLastColumn="0" w:lastRowFirstColumn="0" w:lastRowLastColumn="0"/>
+        </w:trPr>
+        <w:tc>
+          <w:tcPr>
+            <w:cnfStyle w:val="001000000000" w:firstRow="0" w:lastRow="0" w:firstColumn="1" w:lastColumn="0" w:oddVBand="0" w:evenVBand="0" w:oddHBand="0" w:evenHBand="0" w:firstRowFirstColumn="0" w:firstRowLastColumn="0" w:lastRowFirstColumn="0" w:lastRowLastColumn="0"/>
             <w:tcW w:w="2160" w:type="dxa"/>
           </w:tcPr>
           <w:p>
             <w:pPr>
+              <w:rPr>
+                <w:b w:val="0"/>
+                <w:sz w:val="28"/>
+                <w:szCs w:val="28"/>
+              </w:rPr>
+            </w:pPr>
+            <w:proofErr w:type="spellStart"/>
+            <w:r>
+              <w:t>purchase_date</w:t>
+            </w:r>
+            <w:proofErr w:type="spellEnd"/>
+          </w:p>
+        </w:tc>
+        <w:tc>
+          <w:tcPr>
+            <w:tcW w:w="1440" w:type="dxa"/>
+          </w:tcPr>
+          <w:p>
+            <w:pPr>
+              <w:cnfStyle w:val="000000100000" w:firstRow="0" w:lastRow="0" w:firstColumn="0" w:lastColumn="0" w:oddVBand="0" w:evenVBand="0" w:oddHBand="1" w:evenHBand="0" w:firstRowFirstColumn="0" w:firstRowLastColumn="0" w:lastRowFirstColumn="0" w:lastRowLastColumn="0"/>
               <w:rPr>
                 <w:b/>
                 <w:sz w:val="28"/>
                 <w:szCs w:val="28"/>
               </w:rPr>
             </w:pPr>
-            <w:proofErr w:type="spellStart"/>
-            <w:r>
-              <w:t>purchase_trade_id</w:t>
-            </w:r>
-            <w:proofErr w:type="spellEnd"/>
-          </w:p>
-        </w:tc>
-        <w:tc>
-          <w:tcPr>
-            <w:tcW w:w="1440" w:type="dxa"/>
-          </w:tcPr>
-          <w:p>
-            <w:pPr>
-              <w:rPr>
-                <w:b/>
-                <w:sz w:val="28"/>
-                <w:szCs w:val="28"/>
-              </w:rPr>
-            </w:pPr>
-            <w:r>
-              <w:t>UUID</w:t>
+            <w:r>
+              <w:t>Date</w:t>
             </w:r>
           </w:p>
         </w:tc>
@@ -2816,171 +3022,7 @@
           </w:tcPr>
           <w:p>
             <w:pPr>
-              <w:rPr>
-                <w:b/>
-                <w:sz w:val="28"/>
-                <w:szCs w:val="28"/>
-              </w:rPr>
-            </w:pPr>
-            <w:r>
-              <w:t>Reference to the original "BUY" trade.</w:t>
-            </w:r>
-          </w:p>
-        </w:tc>
-      </w:tr>
-      <w:tr>
-        <w:tc>
-          <w:tcPr>
-            <w:tcW w:w="2160" w:type="dxa"/>
-          </w:tcPr>
-          <w:p>
-            <w:pPr>
-              <w:rPr>
-                <w:b/>
-                <w:sz w:val="28"/>
-                <w:szCs w:val="28"/>
-              </w:rPr>
-            </w:pPr>
-            <w:proofErr w:type="spellStart"/>
-            <w:r>
-              <w:t>remaining_qty</w:t>
-            </w:r>
-            <w:proofErr w:type="spellEnd"/>
-          </w:p>
-        </w:tc>
-        <w:tc>
-          <w:tcPr>
-            <w:tcW w:w="1440" w:type="dxa"/>
-          </w:tcPr>
-          <w:p>
-            <w:pPr>
-              <w:rPr>
-                <w:b/>
-                <w:sz w:val="28"/>
-                <w:szCs w:val="28"/>
-              </w:rPr>
-            </w:pPr>
-            <w:r>
-              <w:t>Decimal</w:t>
-            </w:r>
-          </w:p>
-        </w:tc>
-        <w:tc>
-          <w:tcPr>
-            <w:tcW w:w="5755" w:type="dxa"/>
-          </w:tcPr>
-          <w:p>
-            <w:pPr>
-              <w:rPr>
-                <w:b/>
-                <w:sz w:val="28"/>
-                <w:szCs w:val="28"/>
-              </w:rPr>
-            </w:pPr>
-            <w:r>
-              <w:t>Shares currently available for future matching.</w:t>
-            </w:r>
-          </w:p>
-        </w:tc>
-      </w:tr>
-      <w:tr>
-        <w:tc>
-          <w:tcPr>
-            <w:tcW w:w="2160" w:type="dxa"/>
-          </w:tcPr>
-          <w:p>
-            <w:pPr>
-              <w:rPr>
-                <w:b/>
-                <w:sz w:val="28"/>
-                <w:szCs w:val="28"/>
-              </w:rPr>
-            </w:pPr>
-            <w:proofErr w:type="spellStart"/>
-            <w:r>
-              <w:t>cost_basis_tl</w:t>
-            </w:r>
-            <w:proofErr w:type="spellEnd"/>
-          </w:p>
-        </w:tc>
-        <w:tc>
-          <w:tcPr>
-            <w:tcW w:w="1440" w:type="dxa"/>
-          </w:tcPr>
-          <w:p>
-            <w:pPr>
-              <w:rPr>
-                <w:b/>
-                <w:sz w:val="28"/>
-                <w:szCs w:val="28"/>
-              </w:rPr>
-            </w:pPr>
-            <w:r>
-              <w:t>Decimal</w:t>
-            </w:r>
-          </w:p>
-        </w:tc>
-        <w:tc>
-          <w:tcPr>
-            <w:tcW w:w="5755" w:type="dxa"/>
-          </w:tcPr>
-          <w:p>
-            <w:pPr>
-              <w:rPr>
-                <w:b/>
-                <w:sz w:val="28"/>
-                <w:szCs w:val="28"/>
-              </w:rPr>
-            </w:pPr>
-            <w:r>
-              <w:t>The total cost in TRY, calculated at the time of purchase.</w:t>
-            </w:r>
-          </w:p>
-        </w:tc>
-      </w:tr>
-      <w:tr>
-        <w:tc>
-          <w:tcPr>
-            <w:tcW w:w="2160" w:type="dxa"/>
-          </w:tcPr>
-          <w:p>
-            <w:pPr>
-              <w:rPr>
-                <w:b/>
-                <w:sz w:val="28"/>
-                <w:szCs w:val="28"/>
-              </w:rPr>
-            </w:pPr>
-            <w:proofErr w:type="spellStart"/>
-            <w:r>
-              <w:t>purchase_date</w:t>
-            </w:r>
-            <w:proofErr w:type="spellEnd"/>
-          </w:p>
-        </w:tc>
-        <w:tc>
-          <w:tcPr>
-            <w:tcW w:w="1440" w:type="dxa"/>
-          </w:tcPr>
-          <w:p>
-            <w:pPr>
-              <w:rPr>
-                <w:b/>
-                <w:sz w:val="28"/>
-                <w:szCs w:val="28"/>
-              </w:rPr>
-            </w:pPr>
-            <w:r>
-              <w:t>Date</w:t>
-            </w:r>
-          </w:p>
-        </w:tc>
-        <w:tc>
-          <w:tcPr>
-            <w:tcW w:w="5755" w:type="dxa"/>
-          </w:tcPr>
-          <w:p>
-            <w:pPr>
+              <w:cnfStyle w:val="000000100000" w:firstRow="0" w:lastRow="0" w:firstColumn="0" w:lastColumn="0" w:oddVBand="0" w:evenVBand="0" w:oddHBand="1" w:evenHBand="0" w:firstRowFirstColumn="0" w:firstRowLastColumn="0" w:lastRowFirstColumn="0" w:lastRowLastColumn="0"/>
               <w:rPr>
                 <w:b/>
                 <w:sz w:val="28"/>
@@ -3034,7 +3076,7 @@
     </w:p>
     <w:tbl>
       <w:tblPr>
-        <w:tblStyle w:val="TableGrid"/>
+        <w:tblStyle w:val="PlainTable1"/>
         <w:tblW w:w="0" w:type="auto"/>
         <w:tblLook w:val="04A0" w:firstRow="1" w:lastRow="0" w:firstColumn="1" w:lastColumn="0" w:noHBand="0" w:noVBand="1"/>
       </w:tblPr>
@@ -3044,12 +3086,104 @@
         <w:gridCol w:w="5755"/>
       </w:tblGrid>
       <w:tr>
-        <w:tc>
-          <w:tcPr>
+        <w:trPr>
+          <w:cnfStyle w:val="100000000000" w:firstRow="1" w:lastRow="0" w:firstColumn="0" w:lastColumn="0" w:oddVBand="0" w:evenVBand="0" w:oddHBand="0" w:evenHBand="0" w:firstRowFirstColumn="0" w:firstRowLastColumn="0" w:lastRowFirstColumn="0" w:lastRowLastColumn="0"/>
+        </w:trPr>
+        <w:tc>
+          <w:tcPr>
+            <w:cnfStyle w:val="001000000000" w:firstRow="0" w:lastRow="0" w:firstColumn="1" w:lastColumn="0" w:oddVBand="0" w:evenVBand="0" w:oddHBand="0" w:evenHBand="0" w:firstRowFirstColumn="0" w:firstRowLastColumn="0" w:lastRowFirstColumn="0" w:lastRowLastColumn="0"/>
             <w:tcW w:w="2155" w:type="dxa"/>
           </w:tcPr>
           <w:p>
             <w:pPr>
+              <w:rPr>
+                <w:b w:val="0"/>
+                <w:sz w:val="28"/>
+                <w:szCs w:val="28"/>
+              </w:rPr>
+            </w:pPr>
+            <w:r>
+              <w:rPr>
+                <w:szCs w:val="28"/>
+              </w:rPr>
+              <w:t>Attribute</w:t>
+            </w:r>
+          </w:p>
+        </w:tc>
+        <w:tc>
+          <w:tcPr>
+            <w:tcW w:w="1440" w:type="dxa"/>
+          </w:tcPr>
+          <w:p>
+            <w:pPr>
+              <w:cnfStyle w:val="100000000000" w:firstRow="1" w:lastRow="0" w:firstColumn="0" w:lastColumn="0" w:oddVBand="0" w:evenVBand="0" w:oddHBand="0" w:evenHBand="0" w:firstRowFirstColumn="0" w:firstRowLastColumn="0" w:lastRowFirstColumn="0" w:lastRowLastColumn="0"/>
+              <w:rPr>
+                <w:b w:val="0"/>
+                <w:sz w:val="28"/>
+                <w:szCs w:val="28"/>
+              </w:rPr>
+            </w:pPr>
+            <w:r>
+              <w:rPr>
+                <w:szCs w:val="28"/>
+              </w:rPr>
+              <w:t>Type</w:t>
+            </w:r>
+          </w:p>
+        </w:tc>
+        <w:tc>
+          <w:tcPr>
+            <w:tcW w:w="5755" w:type="dxa"/>
+          </w:tcPr>
+          <w:p>
+            <w:pPr>
+              <w:cnfStyle w:val="100000000000" w:firstRow="1" w:lastRow="0" w:firstColumn="0" w:lastColumn="0" w:oddVBand="0" w:evenVBand="0" w:oddHBand="0" w:evenHBand="0" w:firstRowFirstColumn="0" w:firstRowLastColumn="0" w:lastRowFirstColumn="0" w:lastRowLastColumn="0"/>
+              <w:rPr>
+                <w:b w:val="0"/>
+                <w:sz w:val="28"/>
+                <w:szCs w:val="28"/>
+              </w:rPr>
+            </w:pPr>
+            <w:r>
+              <w:rPr>
+                <w:szCs w:val="28"/>
+              </w:rPr>
+              <w:t>Description</w:t>
+            </w:r>
+          </w:p>
+        </w:tc>
+      </w:tr>
+      <w:tr>
+        <w:trPr>
+          <w:cnfStyle w:val="000000100000" w:firstRow="0" w:lastRow="0" w:firstColumn="0" w:lastColumn="0" w:oddVBand="0" w:evenVBand="0" w:oddHBand="1" w:evenHBand="0" w:firstRowFirstColumn="0" w:firstRowLastColumn="0" w:lastRowFirstColumn="0" w:lastRowLastColumn="0"/>
+        </w:trPr>
+        <w:tc>
+          <w:tcPr>
+            <w:cnfStyle w:val="001000000000" w:firstRow="0" w:lastRow="0" w:firstColumn="1" w:lastColumn="0" w:oddVBand="0" w:evenVBand="0" w:oddHBand="0" w:evenHBand="0" w:firstRowFirstColumn="0" w:firstRowLastColumn="0" w:lastRowFirstColumn="0" w:lastRowLastColumn="0"/>
+            <w:tcW w:w="2155" w:type="dxa"/>
+          </w:tcPr>
+          <w:p>
+            <w:pPr>
+              <w:rPr>
+                <w:b w:val="0"/>
+                <w:sz w:val="28"/>
+                <w:szCs w:val="28"/>
+              </w:rPr>
+            </w:pPr>
+            <w:proofErr w:type="spellStart"/>
+            <w:r>
+              <w:t>gain_id</w:t>
+            </w:r>
+            <w:proofErr w:type="spellEnd"/>
+          </w:p>
+        </w:tc>
+        <w:tc>
+          <w:tcPr>
+            <w:tcW w:w="1440" w:type="dxa"/>
+          </w:tcPr>
+          <w:p>
+            <w:pPr>
+              <w:cnfStyle w:val="000000100000" w:firstRow="0" w:lastRow="0" w:firstColumn="0" w:lastColumn="0" w:oddVBand="0" w:evenVBand="0" w:oddHBand="1" w:evenHBand="0" w:firstRowFirstColumn="0" w:firstRowLastColumn="0" w:lastRowFirstColumn="0" w:lastRowLastColumn="0"/>
               <w:rPr>
                 <w:b/>
                 <w:sz w:val="28"/>
@@ -3057,20 +3191,17 @@
               </w:rPr>
             </w:pPr>
             <w:r>
-              <w:rPr>
-                <w:b/>
-                <w:szCs w:val="28"/>
-              </w:rPr>
-              <w:t>Attribute</w:t>
-            </w:r>
-          </w:p>
-        </w:tc>
-        <w:tc>
-          <w:tcPr>
-            <w:tcW w:w="1440" w:type="dxa"/>
-          </w:tcPr>
-          <w:p>
-            <w:pPr>
+              <w:t>UUID</w:t>
+            </w:r>
+          </w:p>
+        </w:tc>
+        <w:tc>
+          <w:tcPr>
+            <w:tcW w:w="5755" w:type="dxa"/>
+          </w:tcPr>
+          <w:p>
+            <w:pPr>
+              <w:cnfStyle w:val="000000100000" w:firstRow="0" w:lastRow="0" w:firstColumn="0" w:lastColumn="0" w:oddVBand="0" w:evenVBand="0" w:oddHBand="1" w:evenHBand="0" w:firstRowFirstColumn="0" w:firstRowLastColumn="0" w:lastRowFirstColumn="0" w:lastRowLastColumn="0"/>
               <w:rPr>
                 <w:b/>
                 <w:sz w:val="28"/>
@@ -3078,20 +3209,39 @@
               </w:rPr>
             </w:pPr>
             <w:r>
-              <w:rPr>
-                <w:b/>
-                <w:szCs w:val="28"/>
-              </w:rPr>
-              <w:t>Type</w:t>
-            </w:r>
-          </w:p>
-        </w:tc>
-        <w:tc>
-          <w:tcPr>
-            <w:tcW w:w="5755" w:type="dxa"/>
-          </w:tcPr>
-          <w:p>
-            <w:pPr>
+              <w:t>Unique identifier for the realized gain/loss entry.</w:t>
+            </w:r>
+          </w:p>
+        </w:tc>
+      </w:tr>
+      <w:tr>
+        <w:tc>
+          <w:tcPr>
+            <w:cnfStyle w:val="001000000000" w:firstRow="0" w:lastRow="0" w:firstColumn="1" w:lastColumn="0" w:oddVBand="0" w:evenVBand="0" w:oddHBand="0" w:evenHBand="0" w:firstRowFirstColumn="0" w:firstRowLastColumn="0" w:lastRowFirstColumn="0" w:lastRowLastColumn="0"/>
+            <w:tcW w:w="2155" w:type="dxa"/>
+          </w:tcPr>
+          <w:p>
+            <w:pPr>
+              <w:rPr>
+                <w:b w:val="0"/>
+                <w:sz w:val="28"/>
+                <w:szCs w:val="28"/>
+              </w:rPr>
+            </w:pPr>
+            <w:proofErr w:type="spellStart"/>
+            <w:r>
+              <w:t>sell_trade_id</w:t>
+            </w:r>
+            <w:proofErr w:type="spellEnd"/>
+          </w:p>
+        </w:tc>
+        <w:tc>
+          <w:tcPr>
+            <w:tcW w:w="1440" w:type="dxa"/>
+          </w:tcPr>
+          <w:p>
+            <w:pPr>
+              <w:cnfStyle w:val="000000000000" w:firstRow="0" w:lastRow="0" w:firstColumn="0" w:lastColumn="0" w:oddVBand="0" w:evenVBand="0" w:oddHBand="0" w:evenHBand="0" w:firstRowFirstColumn="0" w:firstRowLastColumn="0" w:lastRowFirstColumn="0" w:lastRowLastColumn="0"/>
               <w:rPr>
                 <w:b/>
                 <w:sz w:val="28"/>
@@ -3099,41 +3249,78 @@
               </w:rPr>
             </w:pPr>
             <w:r>
+              <w:t>UUID</w:t>
+            </w:r>
+          </w:p>
+        </w:tc>
+        <w:tc>
+          <w:tcPr>
+            <w:tcW w:w="5755" w:type="dxa"/>
+          </w:tcPr>
+          <w:p>
+            <w:pPr>
+              <w:cnfStyle w:val="000000000000" w:firstRow="0" w:lastRow="0" w:firstColumn="0" w:lastColumn="0" w:oddVBand="0" w:evenVBand="0" w:oddHBand="0" w:evenHBand="0" w:firstRowFirstColumn="0" w:firstRowLastColumn="0" w:lastRowFirstColumn="0" w:lastRowLastColumn="0"/>
               <w:rPr>
                 <w:b/>
-                <w:szCs w:val="28"/>
-              </w:rPr>
-              <w:t>Description</w:t>
+                <w:sz w:val="28"/>
+                <w:szCs w:val="28"/>
+              </w:rPr>
+            </w:pPr>
+            <w:r>
+              <w:t>Reference to the "SELL" transaction that triggered this record.</w:t>
             </w:r>
           </w:p>
         </w:tc>
       </w:tr>
       <w:tr>
-        <w:tc>
-          <w:tcPr>
+        <w:trPr>
+          <w:cnfStyle w:val="000000100000" w:firstRow="0" w:lastRow="0" w:firstColumn="0" w:lastColumn="0" w:oddVBand="0" w:evenVBand="0" w:oddHBand="1" w:evenHBand="0" w:firstRowFirstColumn="0" w:firstRowLastColumn="0" w:lastRowFirstColumn="0" w:lastRowLastColumn="0"/>
+        </w:trPr>
+        <w:tc>
+          <w:tcPr>
+            <w:cnfStyle w:val="001000000000" w:firstRow="0" w:lastRow="0" w:firstColumn="1" w:lastColumn="0" w:oddVBand="0" w:evenVBand="0" w:oddHBand="0" w:evenHBand="0" w:firstRowFirstColumn="0" w:firstRowLastColumn="0" w:lastRowFirstColumn="0" w:lastRowLastColumn="0"/>
             <w:tcW w:w="2155" w:type="dxa"/>
           </w:tcPr>
           <w:p>
             <w:pPr>
+              <w:rPr>
+                <w:b w:val="0"/>
+                <w:sz w:val="28"/>
+                <w:szCs w:val="28"/>
+              </w:rPr>
+            </w:pPr>
+            <w:proofErr w:type="spellStart"/>
+            <w:r>
+              <w:t>is_indexed</w:t>
+            </w:r>
+            <w:proofErr w:type="spellEnd"/>
+          </w:p>
+        </w:tc>
+        <w:tc>
+          <w:tcPr>
+            <w:tcW w:w="1440" w:type="dxa"/>
+          </w:tcPr>
+          <w:p>
+            <w:pPr>
+              <w:cnfStyle w:val="000000100000" w:firstRow="0" w:lastRow="0" w:firstColumn="0" w:lastColumn="0" w:oddVBand="0" w:evenVBand="0" w:oddHBand="1" w:evenHBand="0" w:firstRowFirstColumn="0" w:firstRowLastColumn="0" w:lastRowFirstColumn="0" w:lastRowLastColumn="0"/>
               <w:rPr>
                 <w:b/>
                 <w:sz w:val="28"/>
                 <w:szCs w:val="28"/>
               </w:rPr>
             </w:pPr>
-            <w:proofErr w:type="spellStart"/>
-            <w:r>
-              <w:t>gain_id</w:t>
-            </w:r>
-            <w:proofErr w:type="spellEnd"/>
-          </w:p>
-        </w:tc>
-        <w:tc>
-          <w:tcPr>
-            <w:tcW w:w="1440" w:type="dxa"/>
-          </w:tcPr>
-          <w:p>
-            <w:pPr>
+            <w:r>
+              <w:t>Boolean</w:t>
+            </w:r>
+          </w:p>
+        </w:tc>
+        <w:tc>
+          <w:tcPr>
+            <w:tcW w:w="5755" w:type="dxa"/>
+          </w:tcPr>
+          <w:p>
+            <w:pPr>
+              <w:cnfStyle w:val="000000100000" w:firstRow="0" w:lastRow="0" w:firstColumn="0" w:lastColumn="0" w:oddVBand="0" w:evenVBand="0" w:oddHBand="1" w:evenHBand="0" w:firstRowFirstColumn="0" w:firstRowLastColumn="0" w:lastRowFirstColumn="0" w:lastRowLastColumn="0"/>
               <w:rPr>
                 <w:b/>
                 <w:sz w:val="28"/>
@@ -3141,16 +3328,39 @@
               </w:rPr>
             </w:pPr>
             <w:r>
-              <w:t>UUID</w:t>
-            </w:r>
-          </w:p>
-        </w:tc>
-        <w:tc>
-          <w:tcPr>
-            <w:tcW w:w="5755" w:type="dxa"/>
-          </w:tcPr>
-          <w:p>
-            <w:pPr>
+              <w:t>Flag indicating if the 10% WPI threshold was met.</w:t>
+            </w:r>
+          </w:p>
+        </w:tc>
+      </w:tr>
+      <w:tr>
+        <w:tc>
+          <w:tcPr>
+            <w:cnfStyle w:val="001000000000" w:firstRow="0" w:lastRow="0" w:firstColumn="1" w:lastColumn="0" w:oddVBand="0" w:evenVBand="0" w:oddHBand="0" w:evenHBand="0" w:firstRowFirstColumn="0" w:firstRowLastColumn="0" w:lastRowFirstColumn="0" w:lastRowLastColumn="0"/>
+            <w:tcW w:w="2155" w:type="dxa"/>
+          </w:tcPr>
+          <w:p>
+            <w:pPr>
+              <w:rPr>
+                <w:b w:val="0"/>
+                <w:sz w:val="28"/>
+                <w:szCs w:val="28"/>
+              </w:rPr>
+            </w:pPr>
+            <w:proofErr w:type="spellStart"/>
+            <w:r>
+              <w:t>realized_gain_tl</w:t>
+            </w:r>
+            <w:proofErr w:type="spellEnd"/>
+          </w:p>
+        </w:tc>
+        <w:tc>
+          <w:tcPr>
+            <w:tcW w:w="1440" w:type="dxa"/>
+          </w:tcPr>
+          <w:p>
+            <w:pPr>
+              <w:cnfStyle w:val="000000000000" w:firstRow="0" w:lastRow="0" w:firstColumn="0" w:lastColumn="0" w:oddVBand="0" w:evenVBand="0" w:oddHBand="0" w:evenHBand="0" w:firstRowFirstColumn="0" w:firstRowLastColumn="0" w:lastRowFirstColumn="0" w:lastRowLastColumn="0"/>
               <w:rPr>
                 <w:b/>
                 <w:sz w:val="28"/>
@@ -3158,45 +3368,7 @@
               </w:rPr>
             </w:pPr>
             <w:r>
-              <w:t>Unique identifier for the realized gain/loss entry.</w:t>
-            </w:r>
-          </w:p>
-        </w:tc>
-      </w:tr>
-      <w:tr>
-        <w:tc>
-          <w:tcPr>
-            <w:tcW w:w="2155" w:type="dxa"/>
-          </w:tcPr>
-          <w:p>
-            <w:pPr>
-              <w:rPr>
-                <w:b/>
-                <w:sz w:val="28"/>
-                <w:szCs w:val="28"/>
-              </w:rPr>
-            </w:pPr>
-            <w:proofErr w:type="spellStart"/>
-            <w:r>
-              <w:t>sell_trade_id</w:t>
-            </w:r>
-            <w:proofErr w:type="spellEnd"/>
-          </w:p>
-        </w:tc>
-        <w:tc>
-          <w:tcPr>
-            <w:tcW w:w="1440" w:type="dxa"/>
-          </w:tcPr>
-          <w:p>
-            <w:pPr>
-              <w:rPr>
-                <w:b/>
-                <w:sz w:val="28"/>
-                <w:szCs w:val="28"/>
-              </w:rPr>
-            </w:pPr>
-            <w:r>
-              <w:t>UUID</w:t>
+              <w:t>Decimal</w:t>
             </w:r>
           </w:p>
         </w:tc>
@@ -3206,116 +3378,7 @@
           </w:tcPr>
           <w:p>
             <w:pPr>
-              <w:rPr>
-                <w:b/>
-                <w:sz w:val="28"/>
-                <w:szCs w:val="28"/>
-              </w:rPr>
-            </w:pPr>
-            <w:r>
-              <w:t>Reference to the "SELL" transaction that triggered this record.</w:t>
-            </w:r>
-          </w:p>
-        </w:tc>
-      </w:tr>
-      <w:tr>
-        <w:tc>
-          <w:tcPr>
-            <w:tcW w:w="2155" w:type="dxa"/>
-          </w:tcPr>
-          <w:p>
-            <w:pPr>
-              <w:rPr>
-                <w:b/>
-                <w:sz w:val="28"/>
-                <w:szCs w:val="28"/>
-              </w:rPr>
-            </w:pPr>
-            <w:proofErr w:type="spellStart"/>
-            <w:r>
-              <w:t>is_indexed</w:t>
-            </w:r>
-            <w:proofErr w:type="spellEnd"/>
-          </w:p>
-        </w:tc>
-        <w:tc>
-          <w:tcPr>
-            <w:tcW w:w="1440" w:type="dxa"/>
-          </w:tcPr>
-          <w:p>
-            <w:pPr>
-              <w:rPr>
-                <w:b/>
-                <w:sz w:val="28"/>
-                <w:szCs w:val="28"/>
-              </w:rPr>
-            </w:pPr>
-            <w:r>
-              <w:t>Boolean</w:t>
-            </w:r>
-          </w:p>
-        </w:tc>
-        <w:tc>
-          <w:tcPr>
-            <w:tcW w:w="5755" w:type="dxa"/>
-          </w:tcPr>
-          <w:p>
-            <w:pPr>
-              <w:rPr>
-                <w:b/>
-                <w:sz w:val="28"/>
-                <w:szCs w:val="28"/>
-              </w:rPr>
-            </w:pPr>
-            <w:r>
-              <w:t>Flag indicating if the 10% WPI threshold was met.</w:t>
-            </w:r>
-          </w:p>
-        </w:tc>
-      </w:tr>
-      <w:tr>
-        <w:tc>
-          <w:tcPr>
-            <w:tcW w:w="2155" w:type="dxa"/>
-          </w:tcPr>
-          <w:p>
-            <w:pPr>
-              <w:rPr>
-                <w:b/>
-                <w:sz w:val="28"/>
-                <w:szCs w:val="28"/>
-              </w:rPr>
-            </w:pPr>
-            <w:proofErr w:type="spellStart"/>
-            <w:r>
-              <w:t>realized_gain_tl</w:t>
-            </w:r>
-            <w:proofErr w:type="spellEnd"/>
-          </w:p>
-        </w:tc>
-        <w:tc>
-          <w:tcPr>
-            <w:tcW w:w="1440" w:type="dxa"/>
-          </w:tcPr>
-          <w:p>
-            <w:pPr>
-              <w:rPr>
-                <w:b/>
-                <w:sz w:val="28"/>
-                <w:szCs w:val="28"/>
-              </w:rPr>
-            </w:pPr>
-            <w:r>
-              <w:t>Decimal</w:t>
-            </w:r>
-          </w:p>
-        </w:tc>
-        <w:tc>
-          <w:tcPr>
-            <w:tcW w:w="5755" w:type="dxa"/>
-          </w:tcPr>
-          <w:p>
-            <w:pPr>
+              <w:cnfStyle w:val="000000000000" w:firstRow="0" w:lastRow="0" w:firstColumn="0" w:lastColumn="0" w:oddVBand="0" w:evenVBand="0" w:oddHBand="0" w:evenHBand="0" w:firstRowFirstColumn="0" w:firstRowLastColumn="0" w:lastRowFirstColumn="0" w:lastRowLastColumn="0"/>
               <w:rPr>
                 <w:b/>
                 <w:sz w:val="28"/>
@@ -3460,8 +3523,8 @@
           <w:szCs w:val="36"/>
         </w:rPr>
       </w:pPr>
-      <w:bookmarkStart w:id="0" w:name="_b7qhgg5m8uc9" w:colFirst="0" w:colLast="0"/>
-      <w:bookmarkEnd w:id="0"/>
+      <w:bookmarkStart w:id="1" w:name="_b7qhgg5m8uc9" w:colFirst="0" w:colLast="0"/>
+      <w:bookmarkEnd w:id="1"/>
       <w:r>
         <w:rPr>
           <w:sz w:val="36"/>
@@ -3804,8 +3867,8 @@
           <w:szCs w:val="30"/>
         </w:rPr>
       </w:pPr>
-      <w:bookmarkStart w:id="1" w:name="_5nwynsqjk9fy" w:colFirst="0" w:colLast="0"/>
-      <w:bookmarkEnd w:id="1"/>
+      <w:bookmarkStart w:id="2" w:name="_5nwynsqjk9fy" w:colFirst="0" w:colLast="0"/>
+      <w:bookmarkEnd w:id="2"/>
     </w:p>
     <w:p>
       <w:pPr>
@@ -4051,8 +4114,8 @@
       <w:pPr>
         <w:ind w:left="1440"/>
       </w:pPr>
-      <w:bookmarkStart w:id="2" w:name="_dwhr0fqpmbjc" w:colFirst="0" w:colLast="0"/>
-      <w:bookmarkEnd w:id="2"/>
+      <w:bookmarkStart w:id="3" w:name="_dwhr0fqpmbjc" w:colFirst="0" w:colLast="0"/>
+      <w:bookmarkEnd w:id="3"/>
     </w:p>
     <w:p>
       <w:pPr>
@@ -4193,8 +4256,8 @@
           <w:b w:val="0"/>
         </w:rPr>
       </w:pPr>
-      <w:bookmarkStart w:id="3" w:name="_lcx8kexeo86q" w:colFirst="0" w:colLast="0"/>
-      <w:bookmarkEnd w:id="3"/>
+      <w:bookmarkStart w:id="4" w:name="_lcx8kexeo86q" w:colFirst="0" w:colLast="0"/>
+      <w:bookmarkEnd w:id="4"/>
       <w:r>
         <w:lastRenderedPageBreak/>
         <w:t xml:space="preserve">Use Case 3: </w:t>
@@ -4309,8 +4372,8 @@
           <w:sz w:val="36"/>
         </w:rPr>
       </w:pPr>
-      <w:bookmarkStart w:id="4" w:name="_z4dq786do6xz" w:colFirst="0" w:colLast="0"/>
-      <w:bookmarkEnd w:id="4"/>
+      <w:bookmarkStart w:id="5" w:name="_z4dq786do6xz" w:colFirst="0" w:colLast="0"/>
+      <w:bookmarkEnd w:id="5"/>
     </w:p>
     <w:p>
       <w:pPr>
@@ -5604,8 +5667,8 @@
           </wp:inline>
         </w:drawing>
       </w:r>
-      <w:bookmarkStart w:id="5" w:name="_ny7yu76ggvi8" w:colFirst="0" w:colLast="0"/>
-      <w:bookmarkEnd w:id="5"/>
+      <w:bookmarkStart w:id="6" w:name="_ny7yu76ggvi8" w:colFirst="0" w:colLast="0"/>
+      <w:bookmarkEnd w:id="6"/>
     </w:p>
     <w:p>
       <w:pPr>
@@ -5639,8 +5702,8 @@
           <w:szCs w:val="36"/>
         </w:rPr>
       </w:pPr>
-      <w:bookmarkStart w:id="6" w:name="_l4w0oagim72x" w:colFirst="0" w:colLast="0"/>
-      <w:bookmarkEnd w:id="6"/>
+      <w:bookmarkStart w:id="7" w:name="_l4w0oagim72x" w:colFirst="0" w:colLast="0"/>
+      <w:bookmarkEnd w:id="7"/>
       <w:r>
         <w:rPr>
           <w:sz w:val="36"/>
@@ -6231,8 +6294,8 @@
           <w:szCs w:val="30"/>
         </w:rPr>
       </w:pPr>
-      <w:bookmarkStart w:id="7" w:name="_xlp75pqfdi4m" w:colFirst="0" w:colLast="0"/>
-      <w:bookmarkEnd w:id="7"/>
+      <w:bookmarkStart w:id="8" w:name="_xlp75pqfdi4m" w:colFirst="0" w:colLast="0"/>
+      <w:bookmarkEnd w:id="8"/>
       <w:r>
         <w:rPr>
           <w:sz w:val="36"/>
@@ -6240,8 +6303,8 @@
         </w:rPr>
         <w:t>Appendices</w:t>
       </w:r>
-      <w:bookmarkStart w:id="8" w:name="_mh2c9llo3c21" w:colFirst="0" w:colLast="0"/>
-      <w:bookmarkEnd w:id="8"/>
+      <w:bookmarkStart w:id="9" w:name="_mh2c9llo3c21" w:colFirst="0" w:colLast="0"/>
+      <w:bookmarkEnd w:id="9"/>
     </w:p>
     <w:p>
       <w:pPr>
@@ -6264,10 +6327,10 @@
         </w:rPr>
         <w:t>Appendix B: Data Dictionary</w:t>
       </w:r>
-      <w:bookmarkStart w:id="9" w:name="_yvn1gv7ua4b3" w:colFirst="0" w:colLast="0"/>
-      <w:bookmarkStart w:id="10" w:name="_m4mo3lb4zsh6" w:colFirst="0" w:colLast="0"/>
-      <w:bookmarkEnd w:id="9"/>
+      <w:bookmarkStart w:id="10" w:name="_yvn1gv7ua4b3" w:colFirst="0" w:colLast="0"/>
+      <w:bookmarkStart w:id="11" w:name="_m4mo3lb4zsh6" w:colFirst="0" w:colLast="0"/>
       <w:bookmarkEnd w:id="10"/>
+      <w:bookmarkEnd w:id="11"/>
     </w:p>
     <w:p>
       <w:pPr>
@@ -7970,8 +8033,6 @@
               </w:rPr>
               <w:t>audit_note</w:t>
             </w:r>
-            <w:bookmarkStart w:id="11" w:name="_GoBack"/>
-            <w:bookmarkEnd w:id="11"/>
             <w:proofErr w:type="spellEnd"/>
           </w:p>
         </w:tc>
@@ -14203,7 +14264,7 @@
 </file>
 
 <file path=customXml/itemProps1.xml><?xml version="1.0" encoding="utf-8"?>
-<ds:datastoreItem xmlns:ds="http://schemas.openxmlformats.org/officeDocument/2006/customXml" ds:itemID="{1DA15104-16F5-4043-BB3C-80786BA6647E}">
+<ds:datastoreItem xmlns:ds="http://schemas.openxmlformats.org/officeDocument/2006/customXml" ds:itemID="{399359BB-F1AB-4B43-B639-735F4EDF953C}">
   <ds:schemaRefs>
     <ds:schemaRef ds:uri="http://schemas.openxmlformats.org/officeDocument/2006/bibliography"/>
   </ds:schemaRefs>

</xml_diff>

<commit_message>
docs: fix ERD, Class Diagrams and SDS,SRS documents.
</commit_message>
<xml_diff>
--- a/docs/sds.docx
+++ b/docs/sds.docx
@@ -705,8 +705,6 @@
               </w:rPr>
               <w:t>0.3.0</w:t>
             </w:r>
-            <w:bookmarkStart w:id="0" w:name="_GoBack"/>
-            <w:bookmarkEnd w:id="0"/>
           </w:p>
         </w:tc>
       </w:tr>
@@ -1205,106 +1203,13 @@
         <w:rPr>
           <w:b/>
         </w:rPr>
-        <w:t>Appendix A: Use Case Diagram</w:t>
-      </w:r>
-    </w:p>
-    <w:p>
-      <w:pPr>
-        <w:numPr>
-          <w:ilvl w:val="1"/>
-          <w:numId w:val="2"/>
-        </w:numPr>
-        <w:rPr>
-          <w:b/>
-        </w:rPr>
-      </w:pPr>
-      <w:r>
-        <w:rPr>
-          <w:b/>
-        </w:rPr>
-        <w:t>Appendix B: Data Dictionary</w:t>
-      </w:r>
-    </w:p>
-    <w:p>
-      <w:pPr>
-        <w:numPr>
-          <w:ilvl w:val="2"/>
-          <w:numId w:val="2"/>
-        </w:numPr>
-        <w:rPr>
-          <w:b/>
-        </w:rPr>
-      </w:pPr>
-      <w:r>
-        <w:rPr>
-          <w:b/>
-        </w:rPr>
-        <w:t>B1: Use Case Descriptions</w:t>
-      </w:r>
-    </w:p>
-    <w:p>
-      <w:pPr>
-        <w:numPr>
-          <w:ilvl w:val="2"/>
-          <w:numId w:val="2"/>
-        </w:numPr>
-        <w:rPr>
-          <w:b/>
-        </w:rPr>
-      </w:pPr>
-      <w:r>
-        <w:rPr>
-          <w:b/>
-        </w:rPr>
-        <w:t>B</w:t>
-      </w:r>
-      <w:proofErr w:type="gramStart"/>
-      <w:r>
-        <w:rPr>
-          <w:b/>
-        </w:rPr>
-        <w:t>2 :</w:t>
-      </w:r>
-      <w:proofErr w:type="gramEnd"/>
-      <w:r>
-        <w:rPr>
-          <w:b/>
-        </w:rPr>
-        <w:t xml:space="preserve"> Actor Descriptions</w:t>
-      </w:r>
-    </w:p>
-    <w:p>
-      <w:pPr>
-        <w:numPr>
-          <w:ilvl w:val="2"/>
-          <w:numId w:val="2"/>
-        </w:numPr>
-        <w:rPr>
-          <w:b/>
-        </w:rPr>
-      </w:pPr>
-      <w:r>
-        <w:rPr>
-          <w:b/>
-        </w:rPr>
-        <w:t>B3: Class Descriptions</w:t>
-      </w:r>
-    </w:p>
-    <w:p>
-      <w:pPr>
-        <w:numPr>
-          <w:ilvl w:val="1"/>
-          <w:numId w:val="2"/>
-        </w:numPr>
-        <w:rPr>
-          <w:b/>
-        </w:rPr>
-      </w:pPr>
-      <w:r>
-        <w:rPr>
-          <w:b/>
-        </w:rPr>
-        <w:t>Appendix C: List of inputs and outputs</w:t>
+        <w:t>Appendix A</w:t>
+      </w:r>
+      <w:r>
+        <w:rPr>
+          <w:b/>
+        </w:rPr>
+        <w:t>: List of inputs and outputs</w:t>
       </w:r>
       <w:r>
         <w:rPr>
@@ -1390,6 +1295,7 @@
           <w:sz w:val="28"/>
           <w:szCs w:val="28"/>
         </w:rPr>
+        <w:lastRenderedPageBreak/>
         <w:t>Purpose</w:t>
       </w:r>
     </w:p>
@@ -1805,7 +1711,6 @@
           <w:b/>
           <w:szCs w:val="28"/>
         </w:rPr>
-        <w:lastRenderedPageBreak/>
         <w:t>Data Access Layer:</w:t>
       </w:r>
       <w:r>
@@ -1859,7 +1764,14 @@
         <w:rPr>
           <w:szCs w:val="28"/>
         </w:rPr>
-        <w:t xml:space="preserve"> This is the “brain” of the system. The FIFO Matching Engine matches stocks; the Tax Compliance Engine applies Income Tax Law Articles 80-81 rules and the 10% indexing threshold to these matches.</w:t>
+        <w:t xml:space="preserve"> This is the “brain” of the system. The FIFO Matching Engine matches stocks; the Tax Compliance Engine applies </w:t>
+      </w:r>
+      <w:r>
+        <w:rPr>
+          <w:szCs w:val="28"/>
+        </w:rPr>
+        <w:lastRenderedPageBreak/>
+        <w:t>Income Tax Law Articles 80-81 rules and the 10% indexing threshold to these matches.</w:t>
       </w:r>
     </w:p>
     <w:p>
@@ -2026,10 +1938,10 @@
           <w:szCs w:val="28"/>
         </w:rPr>
         <w:drawing>
-          <wp:inline distT="0" distB="0" distL="0" distR="0" wp14:anchorId="2EC67966" wp14:editId="657F5EC7">
-            <wp:extent cx="2606040" cy="3910330"/>
-            <wp:effectExtent l="0" t="0" r="3810" b="0"/>
-            <wp:docPr id="2" name="Picture 2"/>
+          <wp:inline distT="0" distB="0" distL="0" distR="0" wp14:anchorId="71C4FDEE" wp14:editId="33AA2255">
+            <wp:extent cx="2204695" cy="4006850"/>
+            <wp:effectExtent l="0" t="0" r="5715" b="0"/>
+            <wp:docPr id="7" name="Picture 7"/>
             <wp:cNvGraphicFramePr>
               <a:graphicFrameLocks xmlns:a="http://schemas.openxmlformats.org/drawingml/2006/main" noChangeAspect="1"/>
             </wp:cNvGraphicFramePr>
@@ -2037,10 +1949,10 @@
               <a:graphicData uri="http://schemas.openxmlformats.org/drawingml/2006/picture">
                 <pic:pic xmlns:pic="http://schemas.openxmlformats.org/drawingml/2006/picture">
                   <pic:nvPicPr>
-                    <pic:cNvPr id="2" name="ERD_TaxEngine.png"/>
+                    <pic:cNvPr id="7" name="ERD_TaxEngine.png"/>
                     <pic:cNvPicPr/>
                   </pic:nvPicPr>
-                  <pic:blipFill rotWithShape="1">
+                  <pic:blipFill>
                     <a:blip r:embed="rId9" cstate="print">
                       <a:extLst>
                         <a:ext uri="{28A0092B-C50C-407E-A947-70E740481C1C}">
@@ -2048,25 +1960,18 @@
                         </a:ext>
                       </a:extLst>
                     </a:blip>
-                    <a:srcRect l="27949" r="28205"/>
-                    <a:stretch/>
+                    <a:stretch>
+                      <a:fillRect/>
+                    </a:stretch>
                   </pic:blipFill>
-                  <pic:spPr bwMode="auto">
+                  <pic:spPr>
                     <a:xfrm>
                       <a:off x="0" y="0"/>
-                      <a:ext cx="2606040" cy="3910330"/>
+                      <a:ext cx="2212162" cy="4020421"/>
                     </a:xfrm>
                     <a:prstGeom prst="rect">
                       <a:avLst/>
                     </a:prstGeom>
-                    <a:ln>
-                      <a:noFill/>
-                    </a:ln>
-                    <a:extLst>
-                      <a:ext uri="{53640926-AAD7-44D8-BBD7-CCE9431645EC}">
-                        <a14:shadowObscured xmlns:a14="http://schemas.microsoft.com/office/drawing/2010/main"/>
-                      </a:ext>
-                    </a:extLst>
                   </pic:spPr>
                 </pic:pic>
               </a:graphicData>
@@ -2088,6 +1993,17 @@
     </w:p>
     <w:p>
       <w:pPr>
+        <w:ind w:left="720" w:firstLine="720"/>
+        <w:jc w:val="center"/>
+        <w:rPr>
+          <w:b/>
+          <w:sz w:val="28"/>
+          <w:szCs w:val="28"/>
+        </w:rPr>
+      </w:pPr>
+    </w:p>
+    <w:p>
+      <w:pPr>
         <w:numPr>
           <w:ilvl w:val="2"/>
           <w:numId w:val="32"/>
@@ -2129,7 +2045,6 @@
         <w:ind w:left="1440"/>
       </w:pPr>
       <w:r>
-        <w:lastRenderedPageBreak/>
         <w:t xml:space="preserve">The system utilizes structured objects (implemented via </w:t>
       </w:r>
       <w:proofErr w:type="spellStart"/>
@@ -2160,6 +2075,7 @@
         <w:rPr>
           <w:b/>
         </w:rPr>
+        <w:lastRenderedPageBreak/>
         <w:t>Table 1:</w:t>
       </w:r>
       <w:r>
@@ -3523,13 +3439,14 @@
           <w:szCs w:val="36"/>
         </w:rPr>
       </w:pPr>
-      <w:bookmarkStart w:id="1" w:name="_b7qhgg5m8uc9" w:colFirst="0" w:colLast="0"/>
-      <w:bookmarkEnd w:id="1"/>
+      <w:bookmarkStart w:id="0" w:name="_b7qhgg5m8uc9" w:colFirst="0" w:colLast="0"/>
+      <w:bookmarkEnd w:id="0"/>
       <w:r>
         <w:rPr>
           <w:sz w:val="36"/>
           <w:szCs w:val="36"/>
         </w:rPr>
+        <w:lastRenderedPageBreak/>
         <w:t>Detailed Description of System Components</w:t>
       </w:r>
     </w:p>
@@ -3566,10 +3483,18 @@
           <w:noProof/>
         </w:rPr>
         <w:drawing>
-          <wp:inline distT="0" distB="0" distL="0" distR="0" wp14:anchorId="645E7664" wp14:editId="7DA49140">
-            <wp:extent cx="5943600" cy="3691255"/>
+          <wp:anchor distT="0" distB="0" distL="114300" distR="114300" simplePos="0" relativeHeight="251660288" behindDoc="1" locked="0" layoutInCell="1" allowOverlap="1" wp14:anchorId="164BDBF0" wp14:editId="639B45EA">
+            <wp:simplePos x="0" y="0"/>
+            <wp:positionH relativeFrom="column">
+              <wp:posOffset>457200</wp:posOffset>
+            </wp:positionH>
+            <wp:positionV relativeFrom="paragraph">
+              <wp:posOffset>2540</wp:posOffset>
+            </wp:positionV>
+            <wp:extent cx="5943600" cy="2700655"/>
             <wp:effectExtent l="0" t="0" r="0" b="4445"/>
-            <wp:docPr id="3" name="Picture 3"/>
+            <wp:wrapTopAndBottom/>
+            <wp:docPr id="8" name="Picture 8"/>
             <wp:cNvGraphicFramePr>
               <a:graphicFrameLocks xmlns:a="http://schemas.openxmlformats.org/drawingml/2006/main" noChangeAspect="1"/>
             </wp:cNvGraphicFramePr>
@@ -3577,7 +3502,7 @@
               <a:graphicData uri="http://schemas.openxmlformats.org/drawingml/2006/picture">
                 <pic:pic xmlns:pic="http://schemas.openxmlformats.org/drawingml/2006/picture">
                   <pic:nvPicPr>
-                    <pic:cNvPr id="3" name="ClassDiagram_TaxEngine.png"/>
+                    <pic:cNvPr id="8" name="ClassDiagram_TaxEngine.png"/>
                     <pic:cNvPicPr/>
                   </pic:nvPicPr>
                   <pic:blipFill>
@@ -3595,7 +3520,7 @@
                   <pic:spPr>
                     <a:xfrm>
                       <a:off x="0" y="0"/>
-                      <a:ext cx="5943600" cy="3691255"/>
+                      <a:ext cx="5943600" cy="2700655"/>
                     </a:xfrm>
                     <a:prstGeom prst="rect">
                       <a:avLst/>
@@ -3604,7 +3529,7 @@
                 </pic:pic>
               </a:graphicData>
             </a:graphic>
-          </wp:inline>
+          </wp:anchor>
         </w:drawing>
       </w:r>
     </w:p>
@@ -3637,70 +3562,6 @@
     </w:p>
     <w:p>
       <w:pPr>
-        <w:pStyle w:val="ListParagraph"/>
-        <w:rPr>
-          <w:b/>
-          <w:sz w:val="36"/>
-        </w:rPr>
-      </w:pPr>
-    </w:p>
-    <w:p>
-      <w:pPr>
-        <w:pStyle w:val="ListParagraph"/>
-        <w:rPr>
-          <w:b/>
-          <w:sz w:val="36"/>
-        </w:rPr>
-      </w:pPr>
-    </w:p>
-    <w:p>
-      <w:pPr>
-        <w:pStyle w:val="ListParagraph"/>
-        <w:rPr>
-          <w:b/>
-          <w:sz w:val="36"/>
-        </w:rPr>
-      </w:pPr>
-    </w:p>
-    <w:p>
-      <w:pPr>
-        <w:pStyle w:val="ListParagraph"/>
-        <w:rPr>
-          <w:b/>
-          <w:sz w:val="36"/>
-        </w:rPr>
-      </w:pPr>
-    </w:p>
-    <w:p>
-      <w:pPr>
-        <w:pStyle w:val="ListParagraph"/>
-        <w:rPr>
-          <w:b/>
-          <w:sz w:val="36"/>
-        </w:rPr>
-      </w:pPr>
-    </w:p>
-    <w:p>
-      <w:pPr>
-        <w:pStyle w:val="ListParagraph"/>
-        <w:rPr>
-          <w:b/>
-          <w:sz w:val="36"/>
-        </w:rPr>
-      </w:pPr>
-    </w:p>
-    <w:p>
-      <w:pPr>
-        <w:pStyle w:val="ListParagraph"/>
-        <w:rPr>
-          <w:b/>
-          <w:sz w:val="36"/>
-        </w:rPr>
-      </w:pPr>
-    </w:p>
-    <w:p>
-      <w:pPr>
-        <w:pStyle w:val="ListParagraph"/>
         <w:rPr>
           <w:b/>
           <w:sz w:val="36"/>
@@ -3721,7 +3582,6 @@
         </w:rPr>
       </w:pPr>
       <w:r>
-        <w:lastRenderedPageBreak/>
         <w:t xml:space="preserve">Use Case 1: </w:t>
       </w:r>
       <w:r>
@@ -3805,6 +3665,7 @@
           <w:b/>
           <w:noProof/>
         </w:rPr>
+        <w:lastRenderedPageBreak/>
         <w:drawing>
           <wp:anchor distT="0" distB="0" distL="114300" distR="114300" simplePos="0" relativeHeight="251658240" behindDoc="0" locked="0" layoutInCell="1" allowOverlap="1" wp14:anchorId="375625C5" wp14:editId="275F4B94">
             <wp:simplePos x="2057400" y="914400"/>
@@ -3867,8 +3728,8 @@
           <w:szCs w:val="30"/>
         </w:rPr>
       </w:pPr>
-      <w:bookmarkStart w:id="2" w:name="_5nwynsqjk9fy" w:colFirst="0" w:colLast="0"/>
-      <w:bookmarkEnd w:id="2"/>
+      <w:bookmarkStart w:id="1" w:name="_5nwynsqjk9fy" w:colFirst="0" w:colLast="0"/>
+      <w:bookmarkEnd w:id="1"/>
     </w:p>
     <w:p>
       <w:pPr>
@@ -3958,7 +3819,6 @@
           <w:sz w:val="28"/>
           <w:szCs w:val="28"/>
         </w:rPr>
-        <w:lastRenderedPageBreak/>
         <w:t xml:space="preserve">Use Case </w:t>
       </w:r>
       <w:proofErr w:type="gramStart"/>
@@ -4059,6 +3919,7 @@
           <w:sz w:val="28"/>
           <w:szCs w:val="28"/>
         </w:rPr>
+        <w:lastRenderedPageBreak/>
         <w:drawing>
           <wp:anchor distT="0" distB="0" distL="114300" distR="114300" simplePos="0" relativeHeight="251659264" behindDoc="0" locked="0" layoutInCell="1" allowOverlap="1" wp14:anchorId="72EDDA31" wp14:editId="72220651">
             <wp:simplePos x="2057400" y="1693333"/>
@@ -4114,8 +3975,8 @@
       <w:pPr>
         <w:ind w:left="1440"/>
       </w:pPr>
-      <w:bookmarkStart w:id="3" w:name="_dwhr0fqpmbjc" w:colFirst="0" w:colLast="0"/>
-      <w:bookmarkEnd w:id="3"/>
+      <w:bookmarkStart w:id="2" w:name="_dwhr0fqpmbjc" w:colFirst="0" w:colLast="0"/>
+      <w:bookmarkEnd w:id="2"/>
     </w:p>
     <w:p>
       <w:pPr>
@@ -4256,10 +4117,9 @@
           <w:b w:val="0"/>
         </w:rPr>
       </w:pPr>
-      <w:bookmarkStart w:id="4" w:name="_lcx8kexeo86q" w:colFirst="0" w:colLast="0"/>
-      <w:bookmarkEnd w:id="4"/>
-      <w:r>
-        <w:lastRenderedPageBreak/>
+      <w:bookmarkStart w:id="3" w:name="_lcx8kexeo86q" w:colFirst="0" w:colLast="0"/>
+      <w:bookmarkEnd w:id="3"/>
+      <w:r>
         <w:t xml:space="preserve">Use Case 3: </w:t>
       </w:r>
       <w:r>
@@ -4310,6 +4170,7 @@
         <w:rPr>
           <w:b/>
         </w:rPr>
+        <w:lastRenderedPageBreak/>
         <w:t xml:space="preserve">Description: </w:t>
       </w:r>
       <w:r>
@@ -4372,8 +4233,8 @@
           <w:sz w:val="36"/>
         </w:rPr>
       </w:pPr>
-      <w:bookmarkStart w:id="5" w:name="_z4dq786do6xz" w:colFirst="0" w:colLast="0"/>
-      <w:bookmarkEnd w:id="5"/>
+      <w:bookmarkStart w:id="4" w:name="_z4dq786do6xz" w:colFirst="0" w:colLast="0"/>
+      <w:bookmarkEnd w:id="4"/>
     </w:p>
     <w:p>
       <w:pPr>
@@ -4594,7 +4455,6 @@
         <w:ind w:left="1080"/>
       </w:pPr>
       <w:r>
-        <w:lastRenderedPageBreak/>
         <w:t xml:space="preserve">            </w:t>
       </w:r>
       <w:proofErr w:type="spellStart"/>
@@ -4650,6 +4510,7 @@
         <w:ind w:left="1080"/>
       </w:pPr>
       <w:r>
+        <w:lastRenderedPageBreak/>
         <w:t xml:space="preserve">            # Trigger the matching engine to calculate gains and taxes</w:t>
       </w:r>
     </w:p>
@@ -5667,8 +5528,8 @@
           </wp:inline>
         </w:drawing>
       </w:r>
-      <w:bookmarkStart w:id="6" w:name="_ny7yu76ggvi8" w:colFirst="0" w:colLast="0"/>
-      <w:bookmarkEnd w:id="6"/>
+      <w:bookmarkStart w:id="5" w:name="_ny7yu76ggvi8" w:colFirst="0" w:colLast="0"/>
+      <w:bookmarkEnd w:id="5"/>
     </w:p>
     <w:p>
       <w:pPr>
@@ -5702,8 +5563,8 @@
           <w:szCs w:val="36"/>
         </w:rPr>
       </w:pPr>
-      <w:bookmarkStart w:id="7" w:name="_l4w0oagim72x" w:colFirst="0" w:colLast="0"/>
-      <w:bookmarkEnd w:id="7"/>
+      <w:bookmarkStart w:id="6" w:name="_l4w0oagim72x" w:colFirst="0" w:colLast="0"/>
+      <w:bookmarkEnd w:id="6"/>
       <w:r>
         <w:rPr>
           <w:sz w:val="36"/>
@@ -6054,7 +5915,6 @@
           <w:b/>
           <w:sz w:val="28"/>
         </w:rPr>
-        <w:lastRenderedPageBreak/>
         <w:t>Interface</w:t>
       </w:r>
     </w:p>
@@ -6126,6 +5986,7 @@
         <w:rPr>
           <w:b/>
         </w:rPr>
+        <w:lastRenderedPageBreak/>
         <w:t xml:space="preserve">Rationale: </w:t>
       </w:r>
       <w:r>
@@ -6294,8 +6155,8 @@
           <w:szCs w:val="30"/>
         </w:rPr>
       </w:pPr>
-      <w:bookmarkStart w:id="8" w:name="_xlp75pqfdi4m" w:colFirst="0" w:colLast="0"/>
-      <w:bookmarkEnd w:id="8"/>
+      <w:bookmarkStart w:id="7" w:name="_xlp75pqfdi4m" w:colFirst="0" w:colLast="0"/>
+      <w:bookmarkEnd w:id="7"/>
       <w:r>
         <w:rPr>
           <w:sz w:val="36"/>
@@ -6303,12 +6164,16 @@
         </w:rPr>
         <w:t>Appendices</w:t>
       </w:r>
-      <w:bookmarkStart w:id="9" w:name="_mh2c9llo3c21" w:colFirst="0" w:colLast="0"/>
-      <w:bookmarkEnd w:id="9"/>
-    </w:p>
-    <w:p>
-      <w:pPr>
-        <w:pStyle w:val="ListParagraph"/>
+      <w:bookmarkStart w:id="8" w:name="_mh2c9llo3c21" w:colFirst="0" w:colLast="0"/>
+      <w:bookmarkEnd w:id="8"/>
+    </w:p>
+    <w:p>
+      <w:pPr>
+        <w:ind w:left="2160"/>
+      </w:pPr>
+    </w:p>
+    <w:p>
+      <w:pPr>
         <w:numPr>
           <w:ilvl w:val="1"/>
           <w:numId w:val="32"/>
@@ -6325,1893 +6190,15 @@
           <w:sz w:val="28"/>
           <w:szCs w:val="28"/>
         </w:rPr>
-        <w:t>Appendix B: Data Dictionary</w:t>
-      </w:r>
-      <w:bookmarkStart w:id="10" w:name="_yvn1gv7ua4b3" w:colFirst="0" w:colLast="0"/>
-      <w:bookmarkStart w:id="11" w:name="_m4mo3lb4zsh6" w:colFirst="0" w:colLast="0"/>
-      <w:bookmarkEnd w:id="10"/>
-      <w:bookmarkEnd w:id="11"/>
-    </w:p>
-    <w:p>
-      <w:pPr>
-        <w:pStyle w:val="ListParagraph"/>
-        <w:numPr>
-          <w:ilvl w:val="2"/>
-          <w:numId w:val="32"/>
-        </w:numPr>
-        <w:rPr>
-          <w:b/>
-          <w:sz w:val="28"/>
-          <w:szCs w:val="28"/>
-        </w:rPr>
-      </w:pPr>
-      <w:r>
-        <w:rPr>
-          <w:b/>
-          <w:sz w:val="28"/>
-          <w:szCs w:val="28"/>
-        </w:rPr>
-        <w:t>Trade Object</w:t>
-      </w:r>
-    </w:p>
-    <w:tbl>
-      <w:tblPr>
-        <w:tblStyle w:val="PlainTable1"/>
-        <w:tblW w:w="0" w:type="auto"/>
-        <w:tblLayout w:type="fixed"/>
-        <w:tblLook w:val="04A0" w:firstRow="1" w:lastRow="0" w:firstColumn="1" w:lastColumn="0" w:noHBand="0" w:noVBand="1"/>
-      </w:tblPr>
-      <w:tblGrid>
-        <w:gridCol w:w="2337"/>
-        <w:gridCol w:w="2338"/>
-        <w:gridCol w:w="2337"/>
-        <w:gridCol w:w="2338"/>
-      </w:tblGrid>
-      <w:tr>
-        <w:trPr>
-          <w:cnfStyle w:val="100000000000" w:firstRow="1" w:lastRow="0" w:firstColumn="0" w:lastColumn="0" w:oddVBand="0" w:evenVBand="0" w:oddHBand="0" w:evenHBand="0" w:firstRowFirstColumn="0" w:firstRowLastColumn="0" w:lastRowFirstColumn="0" w:lastRowLastColumn="0"/>
-          <w:trHeight w:val="644"/>
-        </w:trPr>
-        <w:tc>
-          <w:tcPr>
-            <w:cnfStyle w:val="001000000000" w:firstRow="0" w:lastRow="0" w:firstColumn="1" w:lastColumn="0" w:oddVBand="0" w:evenVBand="0" w:oddHBand="0" w:evenHBand="0" w:firstRowFirstColumn="0" w:firstRowLastColumn="0" w:lastRowFirstColumn="0" w:lastRowLastColumn="0"/>
-            <w:tcW w:w="2337" w:type="dxa"/>
-          </w:tcPr>
-          <w:p>
-            <w:pPr>
-              <w:rPr>
-                <w:sz w:val="28"/>
-                <w:szCs w:val="28"/>
-              </w:rPr>
-            </w:pPr>
-            <w:r>
-              <w:rPr>
-                <w:sz w:val="28"/>
-                <w:szCs w:val="28"/>
-              </w:rPr>
-              <w:t>Data Element</w:t>
-            </w:r>
-          </w:p>
-        </w:tc>
-        <w:tc>
-          <w:tcPr>
-            <w:tcW w:w="2338" w:type="dxa"/>
-          </w:tcPr>
-          <w:p>
-            <w:pPr>
-              <w:cnfStyle w:val="100000000000" w:firstRow="1" w:lastRow="0" w:firstColumn="0" w:lastColumn="0" w:oddVBand="0" w:evenVBand="0" w:oddHBand="0" w:evenHBand="0" w:firstRowFirstColumn="0" w:firstRowLastColumn="0" w:lastRowFirstColumn="0" w:lastRowLastColumn="0"/>
-              <w:rPr>
-                <w:sz w:val="28"/>
-                <w:szCs w:val="28"/>
-              </w:rPr>
-            </w:pPr>
-            <w:r>
-              <w:rPr>
-                <w:sz w:val="28"/>
-                <w:szCs w:val="28"/>
-              </w:rPr>
-              <w:t xml:space="preserve">Data Type </w:t>
-            </w:r>
-          </w:p>
-        </w:tc>
-        <w:tc>
-          <w:tcPr>
-            <w:tcW w:w="2337" w:type="dxa"/>
-          </w:tcPr>
-          <w:p>
-            <w:pPr>
-              <w:cnfStyle w:val="100000000000" w:firstRow="1" w:lastRow="0" w:firstColumn="0" w:lastColumn="0" w:oddVBand="0" w:evenVBand="0" w:oddHBand="0" w:evenHBand="0" w:firstRowFirstColumn="0" w:firstRowLastColumn="0" w:lastRowFirstColumn="0" w:lastRowLastColumn="0"/>
-              <w:rPr>
-                <w:sz w:val="28"/>
-                <w:szCs w:val="28"/>
-              </w:rPr>
-            </w:pPr>
-            <w:r>
-              <w:rPr>
-                <w:sz w:val="28"/>
-                <w:szCs w:val="28"/>
-              </w:rPr>
-              <w:t>Description</w:t>
-            </w:r>
-          </w:p>
-        </w:tc>
-        <w:tc>
-          <w:tcPr>
-            <w:tcW w:w="2338" w:type="dxa"/>
-          </w:tcPr>
-          <w:p>
-            <w:pPr>
-              <w:cnfStyle w:val="100000000000" w:firstRow="1" w:lastRow="0" w:firstColumn="0" w:lastColumn="0" w:oddVBand="0" w:evenVBand="0" w:oddHBand="0" w:evenHBand="0" w:firstRowFirstColumn="0" w:firstRowLastColumn="0" w:lastRowFirstColumn="0" w:lastRowLastColumn="0"/>
-              <w:rPr>
-                <w:sz w:val="28"/>
-                <w:szCs w:val="28"/>
-              </w:rPr>
-            </w:pPr>
-            <w:r>
-              <w:rPr>
-                <w:sz w:val="28"/>
-                <w:szCs w:val="28"/>
-              </w:rPr>
-              <w:t>Con</w:t>
-            </w:r>
-            <w:r>
-              <w:rPr>
-                <w:sz w:val="28"/>
-                <w:szCs w:val="28"/>
-              </w:rPr>
-              <w:t>s</w:t>
-            </w:r>
-            <w:r>
-              <w:rPr>
-                <w:sz w:val="28"/>
-                <w:szCs w:val="28"/>
-              </w:rPr>
-              <w:t>t</w:t>
-            </w:r>
-            <w:r>
-              <w:rPr>
-                <w:sz w:val="28"/>
-                <w:szCs w:val="28"/>
-              </w:rPr>
-              <w:t>r</w:t>
-            </w:r>
-            <w:r>
-              <w:rPr>
-                <w:sz w:val="28"/>
-                <w:szCs w:val="28"/>
-              </w:rPr>
-              <w:t>ain</w:t>
-            </w:r>
-            <w:r>
-              <w:rPr>
-                <w:sz w:val="28"/>
-                <w:szCs w:val="28"/>
-              </w:rPr>
-              <w:t>t</w:t>
-            </w:r>
-            <w:r>
-              <w:rPr>
-                <w:sz w:val="28"/>
-                <w:szCs w:val="28"/>
-              </w:rPr>
-              <w:t>s/Format</w:t>
-            </w:r>
-          </w:p>
-        </w:tc>
-      </w:tr>
-      <w:tr>
-        <w:trPr>
-          <w:cnfStyle w:val="000000100000" w:firstRow="0" w:lastRow="0" w:firstColumn="0" w:lastColumn="0" w:oddVBand="0" w:evenVBand="0" w:oddHBand="1" w:evenHBand="0" w:firstRowFirstColumn="0" w:firstRowLastColumn="0" w:lastRowFirstColumn="0" w:lastRowLastColumn="0"/>
-          <w:trHeight w:val="644"/>
-        </w:trPr>
-        <w:tc>
-          <w:tcPr>
-            <w:cnfStyle w:val="001000000000" w:firstRow="0" w:lastRow="0" w:firstColumn="1" w:lastColumn="0" w:oddVBand="0" w:evenVBand="0" w:oddHBand="0" w:evenHBand="0" w:firstRowFirstColumn="0" w:firstRowLastColumn="0" w:lastRowFirstColumn="0" w:lastRowLastColumn="0"/>
-            <w:tcW w:w="2337" w:type="dxa"/>
-          </w:tcPr>
-          <w:p>
-            <w:pPr>
-              <w:rPr>
-                <w:b w:val="0"/>
-                <w:szCs w:val="28"/>
-              </w:rPr>
-            </w:pPr>
-            <w:proofErr w:type="spellStart"/>
-            <w:r>
-              <w:rPr>
-                <w:b w:val="0"/>
-                <w:szCs w:val="28"/>
-              </w:rPr>
-              <w:t>trade_id</w:t>
-            </w:r>
-            <w:proofErr w:type="spellEnd"/>
-          </w:p>
-        </w:tc>
-        <w:tc>
-          <w:tcPr>
-            <w:tcW w:w="2338" w:type="dxa"/>
-          </w:tcPr>
-          <w:p>
-            <w:pPr>
-              <w:cnfStyle w:val="000000100000" w:firstRow="0" w:lastRow="0" w:firstColumn="0" w:lastColumn="0" w:oddVBand="0" w:evenVBand="0" w:oddHBand="1" w:evenHBand="0" w:firstRowFirstColumn="0" w:firstRowLastColumn="0" w:lastRowFirstColumn="0" w:lastRowLastColumn="0"/>
-              <w:rPr>
-                <w:szCs w:val="28"/>
-              </w:rPr>
-            </w:pPr>
-            <w:r>
-              <w:rPr>
-                <w:szCs w:val="28"/>
-              </w:rPr>
-              <w:t>UUID</w:t>
-            </w:r>
-          </w:p>
-        </w:tc>
-        <w:tc>
-          <w:tcPr>
-            <w:tcW w:w="2337" w:type="dxa"/>
-          </w:tcPr>
-          <w:p>
-            <w:pPr>
-              <w:cnfStyle w:val="000000100000" w:firstRow="0" w:lastRow="0" w:firstColumn="0" w:lastColumn="0" w:oddVBand="0" w:evenVBand="0" w:oddHBand="1" w:evenHBand="0" w:firstRowFirstColumn="0" w:firstRowLastColumn="0" w:lastRowFirstColumn="0" w:lastRowLastColumn="0"/>
-              <w:rPr>
-                <w:szCs w:val="28"/>
-              </w:rPr>
-            </w:pPr>
-            <w:r>
-              <w:rPr>
-                <w:szCs w:val="28"/>
-              </w:rPr>
-              <w:t>Unique identifier for each transaction</w:t>
-            </w:r>
-          </w:p>
-        </w:tc>
-        <w:tc>
-          <w:tcPr>
-            <w:tcW w:w="2338" w:type="dxa"/>
-          </w:tcPr>
-          <w:p>
-            <w:pPr>
-              <w:cnfStyle w:val="000000100000" w:firstRow="0" w:lastRow="0" w:firstColumn="0" w:lastColumn="0" w:oddVBand="0" w:evenVBand="0" w:oddHBand="1" w:evenHBand="0" w:firstRowFirstColumn="0" w:firstRowLastColumn="0" w:lastRowFirstColumn="0" w:lastRowLastColumn="0"/>
-              <w:rPr>
-                <w:szCs w:val="28"/>
-              </w:rPr>
-            </w:pPr>
-            <w:r>
-              <w:rPr>
-                <w:szCs w:val="28"/>
-              </w:rPr>
-              <w:t>Unique</w:t>
-            </w:r>
-          </w:p>
-        </w:tc>
-      </w:tr>
-      <w:tr>
-        <w:trPr>
-          <w:trHeight w:val="644"/>
-        </w:trPr>
-        <w:tc>
-          <w:tcPr>
-            <w:cnfStyle w:val="001000000000" w:firstRow="0" w:lastRow="0" w:firstColumn="1" w:lastColumn="0" w:oddVBand="0" w:evenVBand="0" w:oddHBand="0" w:evenHBand="0" w:firstRowFirstColumn="0" w:firstRowLastColumn="0" w:lastRowFirstColumn="0" w:lastRowLastColumn="0"/>
-            <w:tcW w:w="2337" w:type="dxa"/>
-          </w:tcPr>
-          <w:p>
-            <w:pPr>
-              <w:rPr>
-                <w:b w:val="0"/>
-                <w:szCs w:val="28"/>
-              </w:rPr>
-            </w:pPr>
-            <w:r>
-              <w:rPr>
-                <w:b w:val="0"/>
-                <w:szCs w:val="28"/>
-              </w:rPr>
-              <w:t>ticker</w:t>
-            </w:r>
-          </w:p>
-        </w:tc>
-        <w:tc>
-          <w:tcPr>
-            <w:tcW w:w="2338" w:type="dxa"/>
-          </w:tcPr>
-          <w:p>
-            <w:pPr>
-              <w:cnfStyle w:val="000000000000" w:firstRow="0" w:lastRow="0" w:firstColumn="0" w:lastColumn="0" w:oddVBand="0" w:evenVBand="0" w:oddHBand="0" w:evenHBand="0" w:firstRowFirstColumn="0" w:firstRowLastColumn="0" w:lastRowFirstColumn="0" w:lastRowLastColumn="0"/>
-              <w:rPr>
-                <w:szCs w:val="28"/>
-              </w:rPr>
-            </w:pPr>
-            <w:r>
-              <w:rPr>
-                <w:szCs w:val="28"/>
-              </w:rPr>
-              <w:t>String</w:t>
-            </w:r>
-          </w:p>
-        </w:tc>
-        <w:tc>
-          <w:tcPr>
-            <w:tcW w:w="2337" w:type="dxa"/>
-          </w:tcPr>
-          <w:p>
-            <w:pPr>
-              <w:cnfStyle w:val="000000000000" w:firstRow="0" w:lastRow="0" w:firstColumn="0" w:lastColumn="0" w:oddVBand="0" w:evenVBand="0" w:oddHBand="0" w:evenHBand="0" w:firstRowFirstColumn="0" w:firstRowLastColumn="0" w:lastRowFirstColumn="0" w:lastRowLastColumn="0"/>
-              <w:rPr>
-                <w:szCs w:val="28"/>
-              </w:rPr>
-            </w:pPr>
-            <w:r>
-              <w:rPr>
-                <w:szCs w:val="28"/>
-              </w:rPr>
-              <w:t>The symbol of traded stock (e.g., APPL)</w:t>
-            </w:r>
-          </w:p>
-        </w:tc>
-        <w:tc>
-          <w:tcPr>
-            <w:tcW w:w="2338" w:type="dxa"/>
-          </w:tcPr>
-          <w:p>
-            <w:pPr>
-              <w:cnfStyle w:val="000000000000" w:firstRow="0" w:lastRow="0" w:firstColumn="0" w:lastColumn="0" w:oddVBand="0" w:evenVBand="0" w:oddHBand="0" w:evenHBand="0" w:firstRowFirstColumn="0" w:firstRowLastColumn="0" w:lastRowFirstColumn="0" w:lastRowLastColumn="0"/>
-              <w:rPr>
-                <w:szCs w:val="28"/>
-              </w:rPr>
-            </w:pPr>
-            <w:r>
-              <w:rPr>
-                <w:szCs w:val="28"/>
-              </w:rPr>
-              <w:t>Uppercase, Non-Empty</w:t>
-            </w:r>
-          </w:p>
-        </w:tc>
-      </w:tr>
-      <w:tr>
-        <w:trPr>
-          <w:cnfStyle w:val="000000100000" w:firstRow="0" w:lastRow="0" w:firstColumn="0" w:lastColumn="0" w:oddVBand="0" w:evenVBand="0" w:oddHBand="1" w:evenHBand="0" w:firstRowFirstColumn="0" w:firstRowLastColumn="0" w:lastRowFirstColumn="0" w:lastRowLastColumn="0"/>
-          <w:trHeight w:val="644"/>
-        </w:trPr>
-        <w:tc>
-          <w:tcPr>
-            <w:cnfStyle w:val="001000000000" w:firstRow="0" w:lastRow="0" w:firstColumn="1" w:lastColumn="0" w:oddVBand="0" w:evenVBand="0" w:oddHBand="0" w:evenHBand="0" w:firstRowFirstColumn="0" w:firstRowLastColumn="0" w:lastRowFirstColumn="0" w:lastRowLastColumn="0"/>
-            <w:tcW w:w="2337" w:type="dxa"/>
-          </w:tcPr>
-          <w:p>
-            <w:pPr>
-              <w:rPr>
-                <w:b w:val="0"/>
-                <w:szCs w:val="28"/>
-              </w:rPr>
-            </w:pPr>
-            <w:proofErr w:type="spellStart"/>
-            <w:r>
-              <w:rPr>
-                <w:b w:val="0"/>
-                <w:szCs w:val="28"/>
-              </w:rPr>
-              <w:t>trade_type</w:t>
-            </w:r>
-            <w:proofErr w:type="spellEnd"/>
-          </w:p>
-        </w:tc>
-        <w:tc>
-          <w:tcPr>
-            <w:tcW w:w="2338" w:type="dxa"/>
-          </w:tcPr>
-          <w:p>
-            <w:pPr>
-              <w:cnfStyle w:val="000000100000" w:firstRow="0" w:lastRow="0" w:firstColumn="0" w:lastColumn="0" w:oddVBand="0" w:evenVBand="0" w:oddHBand="1" w:evenHBand="0" w:firstRowFirstColumn="0" w:firstRowLastColumn="0" w:lastRowFirstColumn="0" w:lastRowLastColumn="0"/>
-              <w:rPr>
-                <w:szCs w:val="28"/>
-              </w:rPr>
-            </w:pPr>
-            <w:proofErr w:type="spellStart"/>
-            <w:r>
-              <w:rPr>
-                <w:szCs w:val="28"/>
-              </w:rPr>
-              <w:t>Enum</w:t>
-            </w:r>
-            <w:proofErr w:type="spellEnd"/>
-          </w:p>
-        </w:tc>
-        <w:tc>
-          <w:tcPr>
-            <w:tcW w:w="2337" w:type="dxa"/>
-          </w:tcPr>
-          <w:p>
-            <w:pPr>
-              <w:cnfStyle w:val="000000100000" w:firstRow="0" w:lastRow="0" w:firstColumn="0" w:lastColumn="0" w:oddVBand="0" w:evenVBand="0" w:oddHBand="1" w:evenHBand="0" w:firstRowFirstColumn="0" w:firstRowLastColumn="0" w:lastRowFirstColumn="0" w:lastRowLastColumn="0"/>
-              <w:rPr>
-                <w:szCs w:val="28"/>
-              </w:rPr>
-            </w:pPr>
-            <w:r>
-              <w:rPr>
-                <w:szCs w:val="28"/>
-              </w:rPr>
-              <w:t>Direction of process (BUY, SELL)</w:t>
-            </w:r>
-          </w:p>
-        </w:tc>
-        <w:tc>
-          <w:tcPr>
-            <w:tcW w:w="2338" w:type="dxa"/>
-          </w:tcPr>
-          <w:p>
-            <w:pPr>
-              <w:cnfStyle w:val="000000100000" w:firstRow="0" w:lastRow="0" w:firstColumn="0" w:lastColumn="0" w:oddVBand="0" w:evenVBand="0" w:oddHBand="1" w:evenHBand="0" w:firstRowFirstColumn="0" w:firstRowLastColumn="0" w:lastRowFirstColumn="0" w:lastRowLastColumn="0"/>
-              <w:rPr>
-                <w:szCs w:val="28"/>
-              </w:rPr>
-            </w:pPr>
-            <w:r>
-              <w:rPr>
-                <w:szCs w:val="28"/>
-              </w:rPr>
-              <w:t xml:space="preserve">Limited to </w:t>
-            </w:r>
-            <w:proofErr w:type="spellStart"/>
-            <w:r>
-              <w:rPr>
-                <w:szCs w:val="28"/>
-              </w:rPr>
-              <w:t>Enum</w:t>
-            </w:r>
-            <w:proofErr w:type="spellEnd"/>
-          </w:p>
-        </w:tc>
-      </w:tr>
-      <w:tr>
-        <w:trPr>
-          <w:trHeight w:val="644"/>
-        </w:trPr>
-        <w:tc>
-          <w:tcPr>
-            <w:cnfStyle w:val="001000000000" w:firstRow="0" w:lastRow="0" w:firstColumn="1" w:lastColumn="0" w:oddVBand="0" w:evenVBand="0" w:oddHBand="0" w:evenHBand="0" w:firstRowFirstColumn="0" w:firstRowLastColumn="0" w:lastRowFirstColumn="0" w:lastRowLastColumn="0"/>
-            <w:tcW w:w="2337" w:type="dxa"/>
-          </w:tcPr>
-          <w:p>
-            <w:pPr>
-              <w:rPr>
-                <w:b w:val="0"/>
-                <w:szCs w:val="28"/>
-              </w:rPr>
-            </w:pPr>
-            <w:proofErr w:type="spellStart"/>
-            <w:r>
-              <w:rPr>
-                <w:b w:val="0"/>
-                <w:szCs w:val="28"/>
-              </w:rPr>
-              <w:t>quantitiy</w:t>
-            </w:r>
-            <w:proofErr w:type="spellEnd"/>
-          </w:p>
-        </w:tc>
-        <w:tc>
-          <w:tcPr>
-            <w:tcW w:w="2338" w:type="dxa"/>
-          </w:tcPr>
-          <w:p>
-            <w:pPr>
-              <w:cnfStyle w:val="000000000000" w:firstRow="0" w:lastRow="0" w:firstColumn="0" w:lastColumn="0" w:oddVBand="0" w:evenVBand="0" w:oddHBand="0" w:evenHBand="0" w:firstRowFirstColumn="0" w:firstRowLastColumn="0" w:lastRowFirstColumn="0" w:lastRowLastColumn="0"/>
-              <w:rPr>
-                <w:szCs w:val="28"/>
-              </w:rPr>
-            </w:pPr>
-            <w:r>
-              <w:rPr>
-                <w:szCs w:val="28"/>
-              </w:rPr>
-              <w:t>Decimal</w:t>
-            </w:r>
-          </w:p>
-        </w:tc>
-        <w:tc>
-          <w:tcPr>
-            <w:tcW w:w="2337" w:type="dxa"/>
-          </w:tcPr>
-          <w:p>
-            <w:pPr>
-              <w:cnfStyle w:val="000000000000" w:firstRow="0" w:lastRow="0" w:firstColumn="0" w:lastColumn="0" w:oddVBand="0" w:evenVBand="0" w:oddHBand="0" w:evenHBand="0" w:firstRowFirstColumn="0" w:firstRowLastColumn="0" w:lastRowFirstColumn="0" w:lastRowLastColumn="0"/>
-              <w:rPr>
-                <w:szCs w:val="28"/>
-              </w:rPr>
-            </w:pPr>
-            <w:r>
-              <w:rPr>
-                <w:szCs w:val="28"/>
-              </w:rPr>
-              <w:t>Number of process</w:t>
-            </w:r>
-          </w:p>
-        </w:tc>
-        <w:tc>
-          <w:tcPr>
-            <w:tcW w:w="2338" w:type="dxa"/>
-          </w:tcPr>
-          <w:p>
-            <w:pPr>
-              <w:cnfStyle w:val="000000000000" w:firstRow="0" w:lastRow="0" w:firstColumn="0" w:lastColumn="0" w:oddVBand="0" w:evenVBand="0" w:oddHBand="0" w:evenHBand="0" w:firstRowFirstColumn="0" w:firstRowLastColumn="0" w:lastRowFirstColumn="0" w:lastRowLastColumn="0"/>
-              <w:rPr>
-                <w:szCs w:val="28"/>
-              </w:rPr>
-            </w:pPr>
-            <w:r>
-              <w:rPr>
-                <w:szCs w:val="28"/>
-              </w:rPr>
-              <w:t>Precision: 2+ Decimal Places</w:t>
-            </w:r>
-          </w:p>
-        </w:tc>
-      </w:tr>
-      <w:tr>
-        <w:trPr>
-          <w:cnfStyle w:val="000000100000" w:firstRow="0" w:lastRow="0" w:firstColumn="0" w:lastColumn="0" w:oddVBand="0" w:evenVBand="0" w:oddHBand="1" w:evenHBand="0" w:firstRowFirstColumn="0" w:firstRowLastColumn="0" w:lastRowFirstColumn="0" w:lastRowLastColumn="0"/>
-          <w:trHeight w:val="644"/>
-        </w:trPr>
-        <w:tc>
-          <w:tcPr>
-            <w:cnfStyle w:val="001000000000" w:firstRow="0" w:lastRow="0" w:firstColumn="1" w:lastColumn="0" w:oddVBand="0" w:evenVBand="0" w:oddHBand="0" w:evenHBand="0" w:firstRowFirstColumn="0" w:firstRowLastColumn="0" w:lastRowFirstColumn="0" w:lastRowLastColumn="0"/>
-            <w:tcW w:w="2337" w:type="dxa"/>
-          </w:tcPr>
-          <w:p>
-            <w:pPr>
-              <w:rPr>
-                <w:b w:val="0"/>
-                <w:szCs w:val="28"/>
-              </w:rPr>
-            </w:pPr>
-            <w:proofErr w:type="spellStart"/>
-            <w:r>
-              <w:rPr>
-                <w:b w:val="0"/>
-                <w:szCs w:val="28"/>
-              </w:rPr>
-              <w:t>price_fc</w:t>
-            </w:r>
-            <w:proofErr w:type="spellEnd"/>
-          </w:p>
-        </w:tc>
-        <w:tc>
-          <w:tcPr>
-            <w:tcW w:w="2338" w:type="dxa"/>
-          </w:tcPr>
-          <w:p>
-            <w:pPr>
-              <w:cnfStyle w:val="000000100000" w:firstRow="0" w:lastRow="0" w:firstColumn="0" w:lastColumn="0" w:oddVBand="0" w:evenVBand="0" w:oddHBand="1" w:evenHBand="0" w:firstRowFirstColumn="0" w:firstRowLastColumn="0" w:lastRowFirstColumn="0" w:lastRowLastColumn="0"/>
-              <w:rPr>
-                <w:szCs w:val="28"/>
-              </w:rPr>
-            </w:pPr>
-            <w:r>
-              <w:rPr>
-                <w:szCs w:val="28"/>
-              </w:rPr>
-              <w:t>Decimal</w:t>
-            </w:r>
-          </w:p>
-        </w:tc>
-        <w:tc>
-          <w:tcPr>
-            <w:tcW w:w="2337" w:type="dxa"/>
-          </w:tcPr>
-          <w:p>
-            <w:pPr>
-              <w:cnfStyle w:val="000000100000" w:firstRow="0" w:lastRow="0" w:firstColumn="0" w:lastColumn="0" w:oddVBand="0" w:evenVBand="0" w:oddHBand="1" w:evenHBand="0" w:firstRowFirstColumn="0" w:firstRowLastColumn="0" w:lastRowFirstColumn="0" w:lastRowLastColumn="0"/>
-              <w:rPr>
-                <w:szCs w:val="28"/>
-              </w:rPr>
-            </w:pPr>
-            <w:r>
-              <w:rPr>
-                <w:szCs w:val="28"/>
-              </w:rPr>
-              <w:t>The price of a share in foreign currency</w:t>
-            </w:r>
-          </w:p>
-        </w:tc>
-        <w:tc>
-          <w:tcPr>
-            <w:tcW w:w="2338" w:type="dxa"/>
-          </w:tcPr>
-          <w:p>
-            <w:pPr>
-              <w:cnfStyle w:val="000000100000" w:firstRow="0" w:lastRow="0" w:firstColumn="0" w:lastColumn="0" w:oddVBand="0" w:evenVBand="0" w:oddHBand="1" w:evenHBand="0" w:firstRowFirstColumn="0" w:firstRowLastColumn="0" w:lastRowFirstColumn="0" w:lastRowLastColumn="0"/>
-              <w:rPr>
-                <w:szCs w:val="28"/>
-              </w:rPr>
-            </w:pPr>
-            <w:r>
-              <w:rPr>
-                <w:szCs w:val="28"/>
-              </w:rPr>
-              <w:t>Foreign Currency (USD)</w:t>
-            </w:r>
-          </w:p>
-        </w:tc>
-      </w:tr>
-      <w:tr>
-        <w:trPr>
-          <w:trHeight w:val="644"/>
-        </w:trPr>
-        <w:tc>
-          <w:tcPr>
-            <w:cnfStyle w:val="001000000000" w:firstRow="0" w:lastRow="0" w:firstColumn="1" w:lastColumn="0" w:oddVBand="0" w:evenVBand="0" w:oddHBand="0" w:evenHBand="0" w:firstRowFirstColumn="0" w:firstRowLastColumn="0" w:lastRowFirstColumn="0" w:lastRowLastColumn="0"/>
-            <w:tcW w:w="2337" w:type="dxa"/>
-          </w:tcPr>
-          <w:p>
-            <w:pPr>
-              <w:rPr>
-                <w:b w:val="0"/>
-                <w:szCs w:val="28"/>
-              </w:rPr>
-            </w:pPr>
-            <w:proofErr w:type="spellStart"/>
-            <w:r>
-              <w:rPr>
-                <w:b w:val="0"/>
-                <w:szCs w:val="28"/>
-              </w:rPr>
-              <w:t>trade_date</w:t>
-            </w:r>
-            <w:proofErr w:type="spellEnd"/>
-          </w:p>
-        </w:tc>
-        <w:tc>
-          <w:tcPr>
-            <w:tcW w:w="2338" w:type="dxa"/>
-          </w:tcPr>
-          <w:p>
-            <w:pPr>
-              <w:cnfStyle w:val="000000000000" w:firstRow="0" w:lastRow="0" w:firstColumn="0" w:lastColumn="0" w:oddVBand="0" w:evenVBand="0" w:oddHBand="0" w:evenHBand="0" w:firstRowFirstColumn="0" w:firstRowLastColumn="0" w:lastRowFirstColumn="0" w:lastRowLastColumn="0"/>
-              <w:rPr>
-                <w:szCs w:val="28"/>
-              </w:rPr>
-            </w:pPr>
-            <w:r>
-              <w:rPr>
-                <w:szCs w:val="28"/>
-              </w:rPr>
-              <w:t>Date</w:t>
-            </w:r>
-          </w:p>
-        </w:tc>
-        <w:tc>
-          <w:tcPr>
-            <w:tcW w:w="2337" w:type="dxa"/>
-          </w:tcPr>
-          <w:p>
-            <w:pPr>
-              <w:cnfStyle w:val="000000000000" w:firstRow="0" w:lastRow="0" w:firstColumn="0" w:lastColumn="0" w:oddVBand="0" w:evenVBand="0" w:oddHBand="0" w:evenHBand="0" w:firstRowFirstColumn="0" w:firstRowLastColumn="0" w:lastRowFirstColumn="0" w:lastRowLastColumn="0"/>
-              <w:rPr>
-                <w:szCs w:val="28"/>
-              </w:rPr>
-            </w:pPr>
-            <w:r>
-              <w:rPr>
-                <w:szCs w:val="28"/>
-              </w:rPr>
-              <w:t>The date of transaction</w:t>
-            </w:r>
-          </w:p>
-        </w:tc>
-        <w:tc>
-          <w:tcPr>
-            <w:tcW w:w="2338" w:type="dxa"/>
-          </w:tcPr>
-          <w:p>
-            <w:pPr>
-              <w:cnfStyle w:val="000000000000" w:firstRow="0" w:lastRow="0" w:firstColumn="0" w:lastColumn="0" w:oddVBand="0" w:evenVBand="0" w:oddHBand="0" w:evenHBand="0" w:firstRowFirstColumn="0" w:firstRowLastColumn="0" w:lastRowFirstColumn="0" w:lastRowLastColumn="0"/>
-              <w:rPr>
-                <w:szCs w:val="28"/>
-              </w:rPr>
-            </w:pPr>
-            <w:r>
-              <w:rPr>
-                <w:szCs w:val="28"/>
-              </w:rPr>
-              <w:t>YYYY-MM-DD</w:t>
-            </w:r>
-          </w:p>
-        </w:tc>
-      </w:tr>
-    </w:tbl>
-    <w:p>
-      <w:pPr>
-        <w:pStyle w:val="ListParagraph"/>
-        <w:ind w:left="2520"/>
-        <w:rPr>
-          <w:b/>
-          <w:sz w:val="28"/>
-          <w:szCs w:val="28"/>
-        </w:rPr>
-      </w:pPr>
-    </w:p>
-    <w:p>
-      <w:pPr>
-        <w:pStyle w:val="ListParagraph"/>
-        <w:ind w:left="2520"/>
-        <w:rPr>
-          <w:b/>
-          <w:sz w:val="28"/>
-          <w:szCs w:val="28"/>
-        </w:rPr>
-      </w:pPr>
-    </w:p>
-    <w:p>
-      <w:pPr>
-        <w:pStyle w:val="ListParagraph"/>
-        <w:ind w:left="2520"/>
-        <w:rPr>
-          <w:b/>
-          <w:sz w:val="28"/>
-          <w:szCs w:val="28"/>
-        </w:rPr>
-      </w:pPr>
-    </w:p>
-    <w:p>
-      <w:pPr>
-        <w:pStyle w:val="ListParagraph"/>
-        <w:ind w:left="2520"/>
-        <w:rPr>
-          <w:b/>
-          <w:sz w:val="28"/>
-          <w:szCs w:val="28"/>
-        </w:rPr>
-      </w:pPr>
-    </w:p>
-    <w:p>
-      <w:pPr>
-        <w:pStyle w:val="ListParagraph"/>
-        <w:ind w:left="2520"/>
-        <w:rPr>
-          <w:b/>
-          <w:sz w:val="28"/>
-          <w:szCs w:val="28"/>
-        </w:rPr>
-      </w:pPr>
-    </w:p>
-    <w:p>
-      <w:pPr>
-        <w:pStyle w:val="ListParagraph"/>
-        <w:numPr>
-          <w:ilvl w:val="0"/>
-          <w:numId w:val="21"/>
-        </w:numPr>
-        <w:rPr>
-          <w:b/>
-          <w:sz w:val="28"/>
-          <w:szCs w:val="28"/>
-        </w:rPr>
-      </w:pPr>
-      <w:r>
-        <w:rPr>
-          <w:b/>
-          <w:sz w:val="28"/>
-          <w:szCs w:val="28"/>
-        </w:rPr>
-        <w:t>FIFO Lot Object</w:t>
-      </w:r>
-    </w:p>
-    <w:tbl>
-      <w:tblPr>
-        <w:tblStyle w:val="PlainTable1"/>
-        <w:tblW w:w="0" w:type="auto"/>
-        <w:tblLayout w:type="fixed"/>
-        <w:tblLook w:val="04A0" w:firstRow="1" w:lastRow="0" w:firstColumn="1" w:lastColumn="0" w:noHBand="0" w:noVBand="1"/>
-      </w:tblPr>
-      <w:tblGrid>
-        <w:gridCol w:w="2337"/>
-        <w:gridCol w:w="2338"/>
-        <w:gridCol w:w="2337"/>
-        <w:gridCol w:w="2338"/>
-      </w:tblGrid>
-      <w:tr>
-        <w:trPr>
-          <w:cnfStyle w:val="100000000000" w:firstRow="1" w:lastRow="0" w:firstColumn="0" w:lastColumn="0" w:oddVBand="0" w:evenVBand="0" w:oddHBand="0" w:evenHBand="0" w:firstRowFirstColumn="0" w:firstRowLastColumn="0" w:lastRowFirstColumn="0" w:lastRowLastColumn="0"/>
-          <w:trHeight w:val="1380"/>
-        </w:trPr>
-        <w:tc>
-          <w:tcPr>
-            <w:cnfStyle w:val="001000000000" w:firstRow="0" w:lastRow="0" w:firstColumn="1" w:lastColumn="0" w:oddVBand="0" w:evenVBand="0" w:oddHBand="0" w:evenHBand="0" w:firstRowFirstColumn="0" w:firstRowLastColumn="0" w:lastRowFirstColumn="0" w:lastRowLastColumn="0"/>
-            <w:tcW w:w="2337" w:type="dxa"/>
-          </w:tcPr>
-          <w:p>
-            <w:pPr>
-              <w:rPr>
-                <w:b w:val="0"/>
-                <w:sz w:val="28"/>
-                <w:szCs w:val="28"/>
-              </w:rPr>
-            </w:pPr>
-            <w:r>
-              <w:rPr>
-                <w:sz w:val="28"/>
-                <w:szCs w:val="28"/>
-              </w:rPr>
-              <w:t>Data Element</w:t>
-            </w:r>
-          </w:p>
-        </w:tc>
-        <w:tc>
-          <w:tcPr>
-            <w:tcW w:w="2338" w:type="dxa"/>
-          </w:tcPr>
-          <w:p>
-            <w:pPr>
-              <w:cnfStyle w:val="100000000000" w:firstRow="1" w:lastRow="0" w:firstColumn="0" w:lastColumn="0" w:oddVBand="0" w:evenVBand="0" w:oddHBand="0" w:evenHBand="0" w:firstRowFirstColumn="0" w:firstRowLastColumn="0" w:lastRowFirstColumn="0" w:lastRowLastColumn="0"/>
-              <w:rPr>
-                <w:b w:val="0"/>
-                <w:sz w:val="28"/>
-                <w:szCs w:val="28"/>
-              </w:rPr>
-            </w:pPr>
-            <w:r>
-              <w:rPr>
-                <w:sz w:val="28"/>
-                <w:szCs w:val="28"/>
-              </w:rPr>
-              <w:t xml:space="preserve">Data Type </w:t>
-            </w:r>
-          </w:p>
-        </w:tc>
-        <w:tc>
-          <w:tcPr>
-            <w:tcW w:w="2337" w:type="dxa"/>
-          </w:tcPr>
-          <w:p>
-            <w:pPr>
-              <w:cnfStyle w:val="100000000000" w:firstRow="1" w:lastRow="0" w:firstColumn="0" w:lastColumn="0" w:oddVBand="0" w:evenVBand="0" w:oddHBand="0" w:evenHBand="0" w:firstRowFirstColumn="0" w:firstRowLastColumn="0" w:lastRowFirstColumn="0" w:lastRowLastColumn="0"/>
-              <w:rPr>
-                <w:b w:val="0"/>
-                <w:sz w:val="28"/>
-                <w:szCs w:val="28"/>
-              </w:rPr>
-            </w:pPr>
-            <w:r>
-              <w:rPr>
-                <w:sz w:val="28"/>
-                <w:szCs w:val="28"/>
-              </w:rPr>
-              <w:t>Description</w:t>
-            </w:r>
-          </w:p>
-        </w:tc>
-        <w:tc>
-          <w:tcPr>
-            <w:tcW w:w="2338" w:type="dxa"/>
-          </w:tcPr>
-          <w:p>
-            <w:pPr>
-              <w:cnfStyle w:val="100000000000" w:firstRow="1" w:lastRow="0" w:firstColumn="0" w:lastColumn="0" w:oddVBand="0" w:evenVBand="0" w:oddHBand="0" w:evenHBand="0" w:firstRowFirstColumn="0" w:firstRowLastColumn="0" w:lastRowFirstColumn="0" w:lastRowLastColumn="0"/>
-              <w:rPr>
-                <w:b w:val="0"/>
-                <w:sz w:val="28"/>
-                <w:szCs w:val="28"/>
-              </w:rPr>
-            </w:pPr>
-            <w:r>
-              <w:rPr>
-                <w:sz w:val="28"/>
-                <w:szCs w:val="28"/>
-              </w:rPr>
-              <w:t>Con</w:t>
-            </w:r>
-            <w:r>
-              <w:rPr>
-                <w:sz w:val="28"/>
-                <w:szCs w:val="28"/>
-              </w:rPr>
-              <w:t>s</w:t>
-            </w:r>
-            <w:r>
-              <w:rPr>
-                <w:sz w:val="28"/>
-                <w:szCs w:val="28"/>
-              </w:rPr>
-              <w:t>t</w:t>
-            </w:r>
-            <w:r>
-              <w:rPr>
-                <w:sz w:val="28"/>
-                <w:szCs w:val="28"/>
-              </w:rPr>
-              <w:t>r</w:t>
-            </w:r>
-            <w:r>
-              <w:rPr>
-                <w:sz w:val="28"/>
-                <w:szCs w:val="28"/>
-              </w:rPr>
-              <w:t>ain</w:t>
-            </w:r>
-            <w:r>
-              <w:rPr>
-                <w:sz w:val="28"/>
-                <w:szCs w:val="28"/>
-              </w:rPr>
-              <w:t>t</w:t>
-            </w:r>
-            <w:r>
-              <w:rPr>
-                <w:sz w:val="28"/>
-                <w:szCs w:val="28"/>
-              </w:rPr>
-              <w:t>s/Format</w:t>
-            </w:r>
-          </w:p>
-        </w:tc>
-      </w:tr>
-      <w:tr>
-        <w:trPr>
-          <w:cnfStyle w:val="000000100000" w:firstRow="0" w:lastRow="0" w:firstColumn="0" w:lastColumn="0" w:oddVBand="0" w:evenVBand="0" w:oddHBand="1" w:evenHBand="0" w:firstRowFirstColumn="0" w:firstRowLastColumn="0" w:lastRowFirstColumn="0" w:lastRowLastColumn="0"/>
-          <w:trHeight w:val="1380"/>
-        </w:trPr>
-        <w:tc>
-          <w:tcPr>
-            <w:cnfStyle w:val="001000000000" w:firstRow="0" w:lastRow="0" w:firstColumn="1" w:lastColumn="0" w:oddVBand="0" w:evenVBand="0" w:oddHBand="0" w:evenHBand="0" w:firstRowFirstColumn="0" w:firstRowLastColumn="0" w:lastRowFirstColumn="0" w:lastRowLastColumn="0"/>
-            <w:tcW w:w="2337" w:type="dxa"/>
-          </w:tcPr>
-          <w:p>
-            <w:proofErr w:type="spellStart"/>
-            <w:r>
-              <w:t>lot_id</w:t>
-            </w:r>
-            <w:proofErr w:type="spellEnd"/>
-          </w:p>
-        </w:tc>
-        <w:tc>
-          <w:tcPr>
-            <w:tcW w:w="2338" w:type="dxa"/>
-          </w:tcPr>
-          <w:p>
-            <w:pPr>
-              <w:cnfStyle w:val="000000100000" w:firstRow="0" w:lastRow="0" w:firstColumn="0" w:lastColumn="0" w:oddVBand="0" w:evenVBand="0" w:oddHBand="1" w:evenHBand="0" w:firstRowFirstColumn="0" w:firstRowLastColumn="0" w:lastRowFirstColumn="0" w:lastRowLastColumn="0"/>
-            </w:pPr>
-            <w:r>
-              <w:t>UUID</w:t>
-            </w:r>
-          </w:p>
-        </w:tc>
-        <w:tc>
-          <w:tcPr>
-            <w:tcW w:w="2337" w:type="dxa"/>
-          </w:tcPr>
-          <w:p>
-            <w:pPr>
-              <w:cnfStyle w:val="000000100000" w:firstRow="0" w:lastRow="0" w:firstColumn="0" w:lastColumn="0" w:oddVBand="0" w:evenVBand="0" w:oddHBand="1" w:evenHBand="0" w:firstRowFirstColumn="0" w:firstRowLastColumn="0" w:lastRowFirstColumn="0" w:lastRowLastColumn="0"/>
-            </w:pPr>
-            <w:r>
-              <w:t>Unique identifier for specific purchase lot</w:t>
-            </w:r>
-          </w:p>
-        </w:tc>
-        <w:tc>
-          <w:tcPr>
-            <w:tcW w:w="2338" w:type="dxa"/>
-          </w:tcPr>
-          <w:p>
-            <w:pPr>
-              <w:cnfStyle w:val="000000100000" w:firstRow="0" w:lastRow="0" w:firstColumn="0" w:lastColumn="0" w:oddVBand="0" w:evenVBand="0" w:oddHBand="1" w:evenHBand="0" w:firstRowFirstColumn="0" w:firstRowLastColumn="0" w:lastRowFirstColumn="0" w:lastRowLastColumn="0"/>
-            </w:pPr>
-            <w:r>
-              <w:t>Internal usage</w:t>
-            </w:r>
-          </w:p>
-        </w:tc>
-      </w:tr>
-      <w:tr>
-        <w:trPr>
-          <w:trHeight w:val="1380"/>
-        </w:trPr>
-        <w:tc>
-          <w:tcPr>
-            <w:cnfStyle w:val="001000000000" w:firstRow="0" w:lastRow="0" w:firstColumn="1" w:lastColumn="0" w:oddVBand="0" w:evenVBand="0" w:oddHBand="0" w:evenHBand="0" w:firstRowFirstColumn="0" w:firstRowLastColumn="0" w:lastRowFirstColumn="0" w:lastRowLastColumn="0"/>
-            <w:tcW w:w="2337" w:type="dxa"/>
-          </w:tcPr>
-          <w:p>
-            <w:proofErr w:type="spellStart"/>
-            <w:r>
-              <w:t>purchase_trade_id</w:t>
-            </w:r>
-            <w:proofErr w:type="spellEnd"/>
-          </w:p>
-        </w:tc>
-        <w:tc>
-          <w:tcPr>
-            <w:tcW w:w="2338" w:type="dxa"/>
-          </w:tcPr>
-          <w:p>
-            <w:pPr>
-              <w:cnfStyle w:val="000000000000" w:firstRow="0" w:lastRow="0" w:firstColumn="0" w:lastColumn="0" w:oddVBand="0" w:evenVBand="0" w:oddHBand="0" w:evenHBand="0" w:firstRowFirstColumn="0" w:firstRowLastColumn="0" w:lastRowFirstColumn="0" w:lastRowLastColumn="0"/>
-            </w:pPr>
-            <w:r>
-              <w:t>UUID</w:t>
-            </w:r>
-          </w:p>
-        </w:tc>
-        <w:tc>
-          <w:tcPr>
-            <w:tcW w:w="2337" w:type="dxa"/>
-          </w:tcPr>
-          <w:p>
-            <w:pPr>
-              <w:cnfStyle w:val="000000000000" w:firstRow="0" w:lastRow="0" w:firstColumn="0" w:lastColumn="0" w:oddVBand="0" w:evenVBand="0" w:oddHBand="0" w:evenHBand="0" w:firstRowFirstColumn="0" w:firstRowLastColumn="0" w:lastRowFirstColumn="0" w:lastRowLastColumn="0"/>
-            </w:pPr>
-            <w:r>
-              <w:t>Reference to the relevant “BUY” transaction</w:t>
-            </w:r>
-          </w:p>
-        </w:tc>
-        <w:tc>
-          <w:tcPr>
-            <w:tcW w:w="2338" w:type="dxa"/>
-          </w:tcPr>
-          <w:p>
-            <w:pPr>
-              <w:cnfStyle w:val="000000000000" w:firstRow="0" w:lastRow="0" w:firstColumn="0" w:lastColumn="0" w:oddVBand="0" w:evenVBand="0" w:oddHBand="0" w:evenHBand="0" w:firstRowFirstColumn="0" w:firstRowLastColumn="0" w:lastRowFirstColumn="0" w:lastRowLastColumn="0"/>
-            </w:pPr>
-            <w:r>
-              <w:t>Foreign Key to Trade</w:t>
-            </w:r>
-          </w:p>
-        </w:tc>
-      </w:tr>
-      <w:tr>
-        <w:trPr>
-          <w:cnfStyle w:val="000000100000" w:firstRow="0" w:lastRow="0" w:firstColumn="0" w:lastColumn="0" w:oddVBand="0" w:evenVBand="0" w:oddHBand="1" w:evenHBand="0" w:firstRowFirstColumn="0" w:firstRowLastColumn="0" w:lastRowFirstColumn="0" w:lastRowLastColumn="0"/>
-          <w:trHeight w:val="1380"/>
-        </w:trPr>
-        <w:tc>
-          <w:tcPr>
-            <w:cnfStyle w:val="001000000000" w:firstRow="0" w:lastRow="0" w:firstColumn="1" w:lastColumn="0" w:oddVBand="0" w:evenVBand="0" w:oddHBand="0" w:evenHBand="0" w:firstRowFirstColumn="0" w:firstRowLastColumn="0" w:lastRowFirstColumn="0" w:lastRowLastColumn="0"/>
-            <w:tcW w:w="2337" w:type="dxa"/>
-          </w:tcPr>
-          <w:p>
-            <w:proofErr w:type="spellStart"/>
-            <w:r>
-              <w:t>remaining_qty</w:t>
-            </w:r>
-            <w:proofErr w:type="spellEnd"/>
-          </w:p>
-        </w:tc>
-        <w:tc>
-          <w:tcPr>
-            <w:tcW w:w="2338" w:type="dxa"/>
-          </w:tcPr>
-          <w:p>
-            <w:pPr>
-              <w:cnfStyle w:val="000000100000" w:firstRow="0" w:lastRow="0" w:firstColumn="0" w:lastColumn="0" w:oddVBand="0" w:evenVBand="0" w:oddHBand="1" w:evenHBand="0" w:firstRowFirstColumn="0" w:firstRowLastColumn="0" w:lastRowFirstColumn="0" w:lastRowLastColumn="0"/>
-            </w:pPr>
-            <w:r>
-              <w:t>Decimal</w:t>
-            </w:r>
-          </w:p>
-        </w:tc>
-        <w:tc>
-          <w:tcPr>
-            <w:tcW w:w="2337" w:type="dxa"/>
-          </w:tcPr>
-          <w:p>
-            <w:pPr>
-              <w:cnfStyle w:val="000000100000" w:firstRow="0" w:lastRow="0" w:firstColumn="0" w:lastColumn="0" w:oddVBand="0" w:evenVBand="0" w:oddHBand="1" w:evenHBand="0" w:firstRowFirstColumn="0" w:firstRowLastColumn="0" w:lastRowFirstColumn="0" w:lastRowLastColumn="0"/>
-            </w:pPr>
-            <w:r>
-              <w:t>Number of shares currently outstanding that have not yet been matched with a sale.</w:t>
-            </w:r>
-          </w:p>
-        </w:tc>
-        <w:tc>
-          <w:tcPr>
-            <w:tcW w:w="2338" w:type="dxa"/>
-          </w:tcPr>
-          <w:p>
-            <w:pPr>
-              <w:cnfStyle w:val="000000100000" w:firstRow="0" w:lastRow="0" w:firstColumn="0" w:lastColumn="0" w:oddVBand="0" w:evenVBand="0" w:oddHBand="1" w:evenHBand="0" w:firstRowFirstColumn="0" w:firstRowLastColumn="0" w:lastRowFirstColumn="0" w:lastRowLastColumn="0"/>
-            </w:pPr>
-            <w:r>
-              <w:t xml:space="preserve">0 &lt;= Q &lt;= </w:t>
-            </w:r>
-            <w:proofErr w:type="spellStart"/>
-            <w:r>
-              <w:t>original_qty</w:t>
-            </w:r>
-            <w:proofErr w:type="spellEnd"/>
-            <w:r>
-              <w:t xml:space="preserve"> </w:t>
-            </w:r>
-          </w:p>
-        </w:tc>
-      </w:tr>
-      <w:tr>
-        <w:trPr>
-          <w:trHeight w:val="1380"/>
-        </w:trPr>
-        <w:tc>
-          <w:tcPr>
-            <w:cnfStyle w:val="001000000000" w:firstRow="0" w:lastRow="0" w:firstColumn="1" w:lastColumn="0" w:oddVBand="0" w:evenVBand="0" w:oddHBand="0" w:evenHBand="0" w:firstRowFirstColumn="0" w:firstRowLastColumn="0" w:lastRowFirstColumn="0" w:lastRowLastColumn="0"/>
-            <w:tcW w:w="2337" w:type="dxa"/>
-          </w:tcPr>
-          <w:p>
-            <w:proofErr w:type="spellStart"/>
-            <w:r>
-              <w:t>cost_basis_tl</w:t>
-            </w:r>
-            <w:proofErr w:type="spellEnd"/>
-          </w:p>
-        </w:tc>
-        <w:tc>
-          <w:tcPr>
-            <w:tcW w:w="2338" w:type="dxa"/>
-          </w:tcPr>
-          <w:p>
-            <w:pPr>
-              <w:cnfStyle w:val="000000000000" w:firstRow="0" w:lastRow="0" w:firstColumn="0" w:lastColumn="0" w:oddVBand="0" w:evenVBand="0" w:oddHBand="0" w:evenHBand="0" w:firstRowFirstColumn="0" w:firstRowLastColumn="0" w:lastRowFirstColumn="0" w:lastRowLastColumn="0"/>
-            </w:pPr>
-            <w:r>
-              <w:t>Decimal</w:t>
-            </w:r>
-          </w:p>
-        </w:tc>
-        <w:tc>
-          <w:tcPr>
-            <w:tcW w:w="2337" w:type="dxa"/>
-          </w:tcPr>
-          <w:p>
-            <w:pPr>
-              <w:cnfStyle w:val="000000000000" w:firstRow="0" w:lastRow="0" w:firstColumn="0" w:lastColumn="0" w:oddVBand="0" w:evenVBand="0" w:oddHBand="0" w:evenHBand="0" w:firstRowFirstColumn="0" w:firstRowLastColumn="0" w:lastRowFirstColumn="0" w:lastRowLastColumn="0"/>
-            </w:pPr>
-            <w:r>
-              <w:t>TRY cost calculated using the CBRT(TCMB) exchange rate on the purchase date</w:t>
-            </w:r>
-          </w:p>
-        </w:tc>
-        <w:tc>
-          <w:tcPr>
-            <w:tcW w:w="2338" w:type="dxa"/>
-          </w:tcPr>
-          <w:p>
-            <w:pPr>
-              <w:cnfStyle w:val="000000000000" w:firstRow="0" w:lastRow="0" w:firstColumn="0" w:lastColumn="0" w:oddVBand="0" w:evenVBand="0" w:oddHBand="0" w:evenHBand="0" w:firstRowFirstColumn="0" w:firstRowLastColumn="0" w:lastRowFirstColumn="0" w:lastRowLastColumn="0"/>
-            </w:pPr>
-            <w:r>
-              <w:t xml:space="preserve">Calculated at </w:t>
-            </w:r>
-          </w:p>
-          <w:p>
-            <w:pPr>
-              <w:cnfStyle w:val="000000000000" w:firstRow="0" w:lastRow="0" w:firstColumn="0" w:lastColumn="0" w:oddVBand="0" w:evenVBand="0" w:oddHBand="0" w:evenHBand="0" w:firstRowFirstColumn="0" w:firstRowLastColumn="0" w:lastRowFirstColumn="0" w:lastRowLastColumn="0"/>
-            </w:pPr>
-            <w:r>
-              <w:t>T = 0</w:t>
-            </w:r>
-          </w:p>
-        </w:tc>
-      </w:tr>
-      <w:tr>
-        <w:trPr>
-          <w:cnfStyle w:val="000000100000" w:firstRow="0" w:lastRow="0" w:firstColumn="0" w:lastColumn="0" w:oddVBand="0" w:evenVBand="0" w:oddHBand="1" w:evenHBand="0" w:firstRowFirstColumn="0" w:firstRowLastColumn="0" w:lastRowFirstColumn="0" w:lastRowLastColumn="0"/>
-          <w:trHeight w:val="1380"/>
-        </w:trPr>
-        <w:tc>
-          <w:tcPr>
-            <w:cnfStyle w:val="001000000000" w:firstRow="0" w:lastRow="0" w:firstColumn="1" w:lastColumn="0" w:oddVBand="0" w:evenVBand="0" w:oddHBand="0" w:evenHBand="0" w:firstRowFirstColumn="0" w:firstRowLastColumn="0" w:lastRowFirstColumn="0" w:lastRowLastColumn="0"/>
-            <w:tcW w:w="2337" w:type="dxa"/>
-          </w:tcPr>
-          <w:p>
-            <w:proofErr w:type="spellStart"/>
-            <w:r>
-              <w:t>purchase_date</w:t>
-            </w:r>
-            <w:proofErr w:type="spellEnd"/>
-          </w:p>
-        </w:tc>
-        <w:tc>
-          <w:tcPr>
-            <w:tcW w:w="2338" w:type="dxa"/>
-          </w:tcPr>
-          <w:p>
-            <w:pPr>
-              <w:cnfStyle w:val="000000100000" w:firstRow="0" w:lastRow="0" w:firstColumn="0" w:lastColumn="0" w:oddVBand="0" w:evenVBand="0" w:oddHBand="1" w:evenHBand="0" w:firstRowFirstColumn="0" w:firstRowLastColumn="0" w:lastRowFirstColumn="0" w:lastRowLastColumn="0"/>
-            </w:pPr>
-            <w:r>
-              <w:t>Date</w:t>
-            </w:r>
-          </w:p>
-        </w:tc>
-        <w:tc>
-          <w:tcPr>
-            <w:tcW w:w="2337" w:type="dxa"/>
-          </w:tcPr>
-          <w:p>
-            <w:pPr>
-              <w:cnfStyle w:val="000000100000" w:firstRow="0" w:lastRow="0" w:firstColumn="0" w:lastColumn="0" w:oddVBand="0" w:evenVBand="0" w:oddHBand="1" w:evenHBand="0" w:firstRowFirstColumn="0" w:firstRowLastColumn="0" w:lastRowFirstColumn="0" w:lastRowLastColumn="0"/>
-            </w:pPr>
-            <w:r>
-              <w:t>Purchase date used for indexing calculations</w:t>
-            </w:r>
-          </w:p>
-        </w:tc>
-        <w:tc>
-          <w:tcPr>
-            <w:tcW w:w="2338" w:type="dxa"/>
-          </w:tcPr>
-          <w:p>
-            <w:pPr>
-              <w:cnfStyle w:val="000000100000" w:firstRow="0" w:lastRow="0" w:firstColumn="0" w:lastColumn="0" w:oddVBand="0" w:evenVBand="0" w:oddHBand="1" w:evenHBand="0" w:firstRowFirstColumn="0" w:firstRowLastColumn="0" w:lastRowFirstColumn="0" w:lastRowLastColumn="0"/>
-            </w:pPr>
-            <w:r>
-              <w:t>Month-1 used for WPI (Yİ-ÜFE)</w:t>
-            </w:r>
-          </w:p>
-        </w:tc>
-      </w:tr>
-    </w:tbl>
-    <w:p>
-      <w:pPr>
-        <w:rPr>
-          <w:b/>
-        </w:rPr>
-      </w:pPr>
-    </w:p>
-    <w:p>
-      <w:pPr>
-        <w:rPr>
-          <w:b/>
-        </w:rPr>
-      </w:pPr>
-    </w:p>
-    <w:p>
-      <w:pPr>
-        <w:rPr>
-          <w:b/>
-        </w:rPr>
-      </w:pPr>
-    </w:p>
-    <w:p>
-      <w:pPr>
-        <w:rPr>
-          <w:b/>
-        </w:rPr>
-      </w:pPr>
-    </w:p>
-    <w:p>
-      <w:pPr>
-        <w:rPr>
-          <w:b/>
-        </w:rPr>
-      </w:pPr>
-    </w:p>
-    <w:p>
-      <w:pPr>
-        <w:rPr>
-          <w:b/>
-        </w:rPr>
-      </w:pPr>
-    </w:p>
-    <w:p>
-      <w:pPr>
-        <w:rPr>
-          <w:b/>
-        </w:rPr>
-      </w:pPr>
-    </w:p>
-    <w:p>
-      <w:pPr>
-        <w:rPr>
-          <w:b/>
-        </w:rPr>
-      </w:pPr>
-    </w:p>
-    <w:p>
-      <w:pPr>
-        <w:rPr>
-          <w:b/>
-        </w:rPr>
-      </w:pPr>
-    </w:p>
-    <w:p>
-      <w:pPr>
-        <w:rPr>
-          <w:b/>
-        </w:rPr>
-      </w:pPr>
-    </w:p>
-    <w:p>
-      <w:pPr>
-        <w:rPr>
-          <w:b/>
-        </w:rPr>
-      </w:pPr>
-    </w:p>
-    <w:p>
-      <w:pPr>
-        <w:pStyle w:val="ListParagraph"/>
-        <w:numPr>
-          <w:ilvl w:val="0"/>
-          <w:numId w:val="21"/>
-        </w:numPr>
-        <w:rPr>
-          <w:b/>
-        </w:rPr>
-      </w:pPr>
-      <w:r>
-        <w:rPr>
-          <w:b/>
-          <w:sz w:val="28"/>
-        </w:rPr>
-        <w:lastRenderedPageBreak/>
-        <w:t>Gain Record Object</w:t>
-      </w:r>
-    </w:p>
-    <w:tbl>
-      <w:tblPr>
-        <w:tblStyle w:val="PlainTable1"/>
-        <w:tblW w:w="0" w:type="auto"/>
-        <w:tblLayout w:type="fixed"/>
-        <w:tblLook w:val="04A0" w:firstRow="1" w:lastRow="0" w:firstColumn="1" w:lastColumn="0" w:noHBand="0" w:noVBand="1"/>
-      </w:tblPr>
-      <w:tblGrid>
-        <w:gridCol w:w="2337"/>
-        <w:gridCol w:w="2068"/>
-        <w:gridCol w:w="270"/>
-        <w:gridCol w:w="2337"/>
-        <w:gridCol w:w="2338"/>
-      </w:tblGrid>
-      <w:tr>
-        <w:trPr>
-          <w:cnfStyle w:val="100000000000" w:firstRow="1" w:lastRow="0" w:firstColumn="0" w:lastColumn="0" w:oddVBand="0" w:evenVBand="0" w:oddHBand="0" w:evenHBand="0" w:firstRowFirstColumn="0" w:firstRowLastColumn="0" w:lastRowFirstColumn="0" w:lastRowLastColumn="0"/>
-          <w:trHeight w:val="1104"/>
-        </w:trPr>
-        <w:tc>
-          <w:tcPr>
-            <w:cnfStyle w:val="001000000000" w:firstRow="0" w:lastRow="0" w:firstColumn="1" w:lastColumn="0" w:oddVBand="0" w:evenVBand="0" w:oddHBand="0" w:evenHBand="0" w:firstRowFirstColumn="0" w:firstRowLastColumn="0" w:lastRowFirstColumn="0" w:lastRowLastColumn="0"/>
-            <w:tcW w:w="2337" w:type="dxa"/>
-          </w:tcPr>
-          <w:p>
-            <w:r>
-              <w:rPr>
-                <w:sz w:val="28"/>
-                <w:szCs w:val="28"/>
-              </w:rPr>
-              <w:t>Data Element</w:t>
-            </w:r>
-          </w:p>
-        </w:tc>
-        <w:tc>
-          <w:tcPr>
-            <w:tcW w:w="2068" w:type="dxa"/>
-          </w:tcPr>
-          <w:p>
-            <w:pPr>
-              <w:cnfStyle w:val="100000000000" w:firstRow="1" w:lastRow="0" w:firstColumn="0" w:lastColumn="0" w:oddVBand="0" w:evenVBand="0" w:oddHBand="0" w:evenHBand="0" w:firstRowFirstColumn="0" w:firstRowLastColumn="0" w:lastRowFirstColumn="0" w:lastRowLastColumn="0"/>
-            </w:pPr>
-            <w:r>
-              <w:rPr>
-                <w:sz w:val="28"/>
-                <w:szCs w:val="28"/>
-              </w:rPr>
-              <w:t xml:space="preserve">Data Type </w:t>
-            </w:r>
-          </w:p>
-        </w:tc>
-        <w:tc>
-          <w:tcPr>
-            <w:tcW w:w="2607" w:type="dxa"/>
-            <w:gridSpan w:val="2"/>
-          </w:tcPr>
-          <w:p>
-            <w:pPr>
-              <w:cnfStyle w:val="100000000000" w:firstRow="1" w:lastRow="0" w:firstColumn="0" w:lastColumn="0" w:oddVBand="0" w:evenVBand="0" w:oddHBand="0" w:evenHBand="0" w:firstRowFirstColumn="0" w:firstRowLastColumn="0" w:lastRowFirstColumn="0" w:lastRowLastColumn="0"/>
-            </w:pPr>
-            <w:r>
-              <w:rPr>
-                <w:sz w:val="28"/>
-                <w:szCs w:val="28"/>
-              </w:rPr>
-              <w:t>Description</w:t>
-            </w:r>
-          </w:p>
-        </w:tc>
-        <w:tc>
-          <w:tcPr>
-            <w:tcW w:w="2338" w:type="dxa"/>
-          </w:tcPr>
-          <w:p>
-            <w:pPr>
-              <w:cnfStyle w:val="100000000000" w:firstRow="1" w:lastRow="0" w:firstColumn="0" w:lastColumn="0" w:oddVBand="0" w:evenVBand="0" w:oddHBand="0" w:evenHBand="0" w:firstRowFirstColumn="0" w:firstRowLastColumn="0" w:lastRowFirstColumn="0" w:lastRowLastColumn="0"/>
-            </w:pPr>
-            <w:r>
-              <w:rPr>
-                <w:sz w:val="28"/>
-                <w:szCs w:val="28"/>
-              </w:rPr>
-              <w:t>Constraints/Format</w:t>
-            </w:r>
-          </w:p>
-        </w:tc>
-      </w:tr>
-      <w:tr>
-        <w:trPr>
-          <w:cnfStyle w:val="000000100000" w:firstRow="0" w:lastRow="0" w:firstColumn="0" w:lastColumn="0" w:oddVBand="0" w:evenVBand="0" w:oddHBand="1" w:evenHBand="0" w:firstRowFirstColumn="0" w:firstRowLastColumn="0" w:lastRowFirstColumn="0" w:lastRowLastColumn="0"/>
-          <w:trHeight w:val="1104"/>
-        </w:trPr>
-        <w:tc>
-          <w:tcPr>
-            <w:cnfStyle w:val="001000000000" w:firstRow="0" w:lastRow="0" w:firstColumn="1" w:lastColumn="0" w:oddVBand="0" w:evenVBand="0" w:oddHBand="0" w:evenHBand="0" w:firstRowFirstColumn="0" w:firstRowLastColumn="0" w:lastRowFirstColumn="0" w:lastRowLastColumn="0"/>
-            <w:tcW w:w="2337" w:type="dxa"/>
-          </w:tcPr>
-          <w:p>
-            <w:pPr>
-              <w:rPr>
-                <w:b w:val="0"/>
-              </w:rPr>
-            </w:pPr>
-            <w:proofErr w:type="spellStart"/>
-            <w:r>
-              <w:rPr>
-                <w:b w:val="0"/>
-              </w:rPr>
-              <w:t>gain_id</w:t>
-            </w:r>
-            <w:proofErr w:type="spellEnd"/>
-          </w:p>
-        </w:tc>
-        <w:tc>
-          <w:tcPr>
-            <w:tcW w:w="2068" w:type="dxa"/>
-          </w:tcPr>
-          <w:p>
-            <w:pPr>
-              <w:cnfStyle w:val="000000100000" w:firstRow="0" w:lastRow="0" w:firstColumn="0" w:lastColumn="0" w:oddVBand="0" w:evenVBand="0" w:oddHBand="1" w:evenHBand="0" w:firstRowFirstColumn="0" w:firstRowLastColumn="0" w:lastRowFirstColumn="0" w:lastRowLastColumn="0"/>
-            </w:pPr>
-            <w:r>
-              <w:t>UUID</w:t>
-            </w:r>
-          </w:p>
-        </w:tc>
-        <w:tc>
-          <w:tcPr>
-            <w:tcW w:w="2607" w:type="dxa"/>
-            <w:gridSpan w:val="2"/>
-          </w:tcPr>
-          <w:p>
-            <w:pPr>
-              <w:cnfStyle w:val="000000100000" w:firstRow="0" w:lastRow="0" w:firstColumn="0" w:lastColumn="0" w:oddVBand="0" w:evenVBand="0" w:oddHBand="1" w:evenHBand="0" w:firstRowFirstColumn="0" w:firstRowLastColumn="0" w:lastRowFirstColumn="0" w:lastRowLastColumn="0"/>
-            </w:pPr>
-            <w:r>
-              <w:t>Unique ID for the realized gain entry.</w:t>
-            </w:r>
-          </w:p>
-        </w:tc>
-        <w:tc>
-          <w:tcPr>
-            <w:tcW w:w="2338" w:type="dxa"/>
-          </w:tcPr>
-          <w:p>
-            <w:pPr>
-              <w:cnfStyle w:val="000000100000" w:firstRow="0" w:lastRow="0" w:firstColumn="0" w:lastColumn="0" w:oddVBand="0" w:evenVBand="0" w:oddHBand="1" w:evenHBand="0" w:firstRowFirstColumn="0" w:firstRowLastColumn="0" w:lastRowFirstColumn="0" w:lastRowLastColumn="0"/>
-            </w:pPr>
-            <w:r>
-              <w:t>Unique</w:t>
-            </w:r>
-          </w:p>
-        </w:tc>
-      </w:tr>
-      <w:tr>
-        <w:trPr>
-          <w:trHeight w:val="1104"/>
-        </w:trPr>
-        <w:tc>
-          <w:tcPr>
-            <w:cnfStyle w:val="001000000000" w:firstRow="0" w:lastRow="0" w:firstColumn="1" w:lastColumn="0" w:oddVBand="0" w:evenVBand="0" w:oddHBand="0" w:evenHBand="0" w:firstRowFirstColumn="0" w:firstRowLastColumn="0" w:lastRowFirstColumn="0" w:lastRowLastColumn="0"/>
-            <w:tcW w:w="2337" w:type="dxa"/>
-          </w:tcPr>
-          <w:p>
-            <w:pPr>
-              <w:rPr>
-                <w:b w:val="0"/>
-              </w:rPr>
-            </w:pPr>
-            <w:proofErr w:type="spellStart"/>
-            <w:r>
-              <w:rPr>
-                <w:b w:val="0"/>
-              </w:rPr>
-              <w:t>sell_trade_id</w:t>
-            </w:r>
-            <w:proofErr w:type="spellEnd"/>
-          </w:p>
-        </w:tc>
-        <w:tc>
-          <w:tcPr>
-            <w:tcW w:w="2068" w:type="dxa"/>
-          </w:tcPr>
-          <w:p>
-            <w:pPr>
-              <w:cnfStyle w:val="000000000000" w:firstRow="0" w:lastRow="0" w:firstColumn="0" w:lastColumn="0" w:oddVBand="0" w:evenVBand="0" w:oddHBand="0" w:evenHBand="0" w:firstRowFirstColumn="0" w:firstRowLastColumn="0" w:lastRowFirstColumn="0" w:lastRowLastColumn="0"/>
-            </w:pPr>
-            <w:r>
-              <w:t>UUID</w:t>
-            </w:r>
-          </w:p>
-        </w:tc>
-        <w:tc>
-          <w:tcPr>
-            <w:tcW w:w="2607" w:type="dxa"/>
-            <w:gridSpan w:val="2"/>
-          </w:tcPr>
-          <w:p>
-            <w:pPr>
-              <w:cnfStyle w:val="000000000000" w:firstRow="0" w:lastRow="0" w:firstColumn="0" w:lastColumn="0" w:oddVBand="0" w:evenVBand="0" w:oddHBand="0" w:evenHBand="0" w:firstRowFirstColumn="0" w:firstRowLastColumn="0" w:lastRowFirstColumn="0" w:lastRowLastColumn="0"/>
-            </w:pPr>
-            <w:proofErr w:type="spellStart"/>
-            <w:r>
-              <w:t>Referance</w:t>
-            </w:r>
-            <w:proofErr w:type="spellEnd"/>
-            <w:r>
-              <w:t xml:space="preserve"> of the “SELL” transaction that triggered this record.</w:t>
-            </w:r>
-          </w:p>
-        </w:tc>
-        <w:tc>
-          <w:tcPr>
-            <w:tcW w:w="2338" w:type="dxa"/>
-          </w:tcPr>
-          <w:p>
-            <w:pPr>
-              <w:cnfStyle w:val="000000000000" w:firstRow="0" w:lastRow="0" w:firstColumn="0" w:lastColumn="0" w:oddVBand="0" w:evenVBand="0" w:oddHBand="0" w:evenHBand="0" w:firstRowFirstColumn="0" w:firstRowLastColumn="0" w:lastRowFirstColumn="0" w:lastRowLastColumn="0"/>
-            </w:pPr>
-            <w:r>
-              <w:t>Foreign Key to Trade</w:t>
-            </w:r>
-          </w:p>
-        </w:tc>
-      </w:tr>
-      <w:tr>
-        <w:trPr>
-          <w:cnfStyle w:val="000000100000" w:firstRow="0" w:lastRow="0" w:firstColumn="0" w:lastColumn="0" w:oddVBand="0" w:evenVBand="0" w:oddHBand="1" w:evenHBand="0" w:firstRowFirstColumn="0" w:firstRowLastColumn="0" w:lastRowFirstColumn="0" w:lastRowLastColumn="0"/>
-          <w:trHeight w:val="1104"/>
-        </w:trPr>
-        <w:tc>
-          <w:tcPr>
-            <w:cnfStyle w:val="001000000000" w:firstRow="0" w:lastRow="0" w:firstColumn="1" w:lastColumn="0" w:oddVBand="0" w:evenVBand="0" w:oddHBand="0" w:evenHBand="0" w:firstRowFirstColumn="0" w:firstRowLastColumn="0" w:lastRowFirstColumn="0" w:lastRowLastColumn="0"/>
-            <w:tcW w:w="2337" w:type="dxa"/>
-          </w:tcPr>
-          <w:p>
-            <w:pPr>
-              <w:rPr>
-                <w:b w:val="0"/>
-              </w:rPr>
-            </w:pPr>
-            <w:proofErr w:type="spellStart"/>
-            <w:r>
-              <w:rPr>
-                <w:b w:val="0"/>
-              </w:rPr>
-              <w:t>is_indexed</w:t>
-            </w:r>
-            <w:proofErr w:type="spellEnd"/>
-          </w:p>
-        </w:tc>
-        <w:tc>
-          <w:tcPr>
-            <w:tcW w:w="2068" w:type="dxa"/>
-          </w:tcPr>
-          <w:p>
-            <w:pPr>
-              <w:cnfStyle w:val="000000100000" w:firstRow="0" w:lastRow="0" w:firstColumn="0" w:lastColumn="0" w:oddVBand="0" w:evenVBand="0" w:oddHBand="1" w:evenHBand="0" w:firstRowFirstColumn="0" w:firstRowLastColumn="0" w:lastRowFirstColumn="0" w:lastRowLastColumn="0"/>
-            </w:pPr>
-            <w:r>
-              <w:t>Boolean</w:t>
-            </w:r>
-          </w:p>
-        </w:tc>
-        <w:tc>
-          <w:tcPr>
-            <w:tcW w:w="2607" w:type="dxa"/>
-            <w:gridSpan w:val="2"/>
-          </w:tcPr>
-          <w:p>
-            <w:pPr>
-              <w:cnfStyle w:val="000000100000" w:firstRow="0" w:lastRow="0" w:firstColumn="0" w:lastColumn="0" w:oddVBand="0" w:evenVBand="0" w:oddHBand="1" w:evenHBand="0" w:firstRowFirstColumn="0" w:firstRowLastColumn="0" w:lastRowFirstColumn="0" w:lastRowLastColumn="0"/>
-            </w:pPr>
-            <w:r>
-              <w:t>Indicates whether the Yİ-ÜFE increase is</w:t>
-            </w:r>
-            <w:r>
-              <w:t xml:space="preserve"> more than 10%</w:t>
-            </w:r>
-          </w:p>
-        </w:tc>
-        <w:tc>
-          <w:tcPr>
-            <w:tcW w:w="2338" w:type="dxa"/>
-          </w:tcPr>
-          <w:p>
-            <w:pPr>
-              <w:cnfStyle w:val="000000100000" w:firstRow="0" w:lastRow="0" w:firstColumn="0" w:lastColumn="0" w:oddVBand="0" w:evenVBand="0" w:oddHBand="1" w:evenHBand="0" w:firstRowFirstColumn="0" w:firstRowLastColumn="0" w:lastRowFirstColumn="0" w:lastRowLastColumn="0"/>
-            </w:pPr>
-            <w:r>
-              <w:t>GVK81 Compliance</w:t>
-            </w:r>
-          </w:p>
-        </w:tc>
-      </w:tr>
-      <w:tr>
-        <w:trPr>
-          <w:trHeight w:val="1104"/>
-        </w:trPr>
-        <w:tc>
-          <w:tcPr>
-            <w:cnfStyle w:val="001000000000" w:firstRow="0" w:lastRow="0" w:firstColumn="1" w:lastColumn="0" w:oddVBand="0" w:evenVBand="0" w:oddHBand="0" w:evenHBand="0" w:firstRowFirstColumn="0" w:firstRowLastColumn="0" w:lastRowFirstColumn="0" w:lastRowLastColumn="0"/>
-            <w:tcW w:w="2337" w:type="dxa"/>
-          </w:tcPr>
-          <w:p>
-            <w:pPr>
-              <w:rPr>
-                <w:b w:val="0"/>
-              </w:rPr>
-            </w:pPr>
-            <w:proofErr w:type="spellStart"/>
-            <w:r>
-              <w:rPr>
-                <w:b w:val="0"/>
-              </w:rPr>
-              <w:t>realized_gain_tl</w:t>
-            </w:r>
-            <w:proofErr w:type="spellEnd"/>
-          </w:p>
-        </w:tc>
-        <w:tc>
-          <w:tcPr>
-            <w:tcW w:w="2068" w:type="dxa"/>
-          </w:tcPr>
-          <w:p>
-            <w:pPr>
-              <w:cnfStyle w:val="000000000000" w:firstRow="0" w:lastRow="0" w:firstColumn="0" w:lastColumn="0" w:oddVBand="0" w:evenVBand="0" w:oddHBand="0" w:evenHBand="0" w:firstRowFirstColumn="0" w:firstRowLastColumn="0" w:lastRowFirstColumn="0" w:lastRowLastColumn="0"/>
-            </w:pPr>
-            <w:r>
-              <w:t>Decimal</w:t>
-            </w:r>
-          </w:p>
-        </w:tc>
-        <w:tc>
-          <w:tcPr>
-            <w:tcW w:w="2607" w:type="dxa"/>
-            <w:gridSpan w:val="2"/>
-          </w:tcPr>
-          <w:p>
-            <w:pPr>
-              <w:cnfStyle w:val="000000000000" w:firstRow="0" w:lastRow="0" w:firstColumn="0" w:lastColumn="0" w:oddVBand="0" w:evenVBand="0" w:oddHBand="0" w:evenHBand="0" w:firstRowFirstColumn="0" w:firstRowLastColumn="0" w:lastRowFirstColumn="0" w:lastRowLastColumn="0"/>
-            </w:pPr>
-            <w:r>
-              <w:t>Net taxable income after indexation (TRY)</w:t>
-            </w:r>
-          </w:p>
-        </w:tc>
-        <w:tc>
-          <w:tcPr>
-            <w:tcW w:w="2338" w:type="dxa"/>
-          </w:tcPr>
-          <w:p>
-            <w:pPr>
-              <w:cnfStyle w:val="000000000000" w:firstRow="0" w:lastRow="0" w:firstColumn="0" w:lastColumn="0" w:oddVBand="0" w:evenVBand="0" w:oddHBand="0" w:evenHBand="0" w:firstRowFirstColumn="0" w:firstRowLastColumn="0" w:lastRowFirstColumn="0" w:lastRowLastColumn="0"/>
-            </w:pPr>
-            <w:r>
-              <w:t xml:space="preserve">Net profit/loss </w:t>
-            </w:r>
-          </w:p>
-        </w:tc>
-      </w:tr>
-      <w:tr>
-        <w:trPr>
-          <w:cnfStyle w:val="000000100000" w:firstRow="0" w:lastRow="0" w:firstColumn="0" w:lastColumn="0" w:oddVBand="0" w:evenVBand="0" w:oddHBand="1" w:evenHBand="0" w:firstRowFirstColumn="0" w:firstRowLastColumn="0" w:lastRowFirstColumn="0" w:lastRowLastColumn="0"/>
-          <w:trHeight w:val="1104"/>
-        </w:trPr>
-        <w:tc>
-          <w:tcPr>
-            <w:cnfStyle w:val="001000000000" w:firstRow="0" w:lastRow="0" w:firstColumn="1" w:lastColumn="0" w:oddVBand="0" w:evenVBand="0" w:oddHBand="0" w:evenHBand="0" w:firstRowFirstColumn="0" w:firstRowLastColumn="0" w:lastRowFirstColumn="0" w:lastRowLastColumn="0"/>
-            <w:tcW w:w="2337" w:type="dxa"/>
-          </w:tcPr>
-          <w:p>
-            <w:pPr>
-              <w:rPr>
-                <w:b w:val="0"/>
-              </w:rPr>
-            </w:pPr>
-            <w:proofErr w:type="spellStart"/>
-            <w:r>
-              <w:rPr>
-                <w:b w:val="0"/>
-              </w:rPr>
-              <w:t>audit_note</w:t>
-            </w:r>
-            <w:proofErr w:type="spellEnd"/>
-          </w:p>
-        </w:tc>
-        <w:tc>
-          <w:tcPr>
-            <w:tcW w:w="2338" w:type="dxa"/>
-            <w:gridSpan w:val="2"/>
-          </w:tcPr>
-          <w:p>
-            <w:pPr>
-              <w:cnfStyle w:val="000000100000" w:firstRow="0" w:lastRow="0" w:firstColumn="0" w:lastColumn="0" w:oddVBand="0" w:evenVBand="0" w:oddHBand="1" w:evenHBand="0" w:firstRowFirstColumn="0" w:firstRowLastColumn="0" w:lastRowFirstColumn="0" w:lastRowLastColumn="0"/>
-            </w:pPr>
-            <w:r>
-              <w:t>String</w:t>
-            </w:r>
-          </w:p>
-        </w:tc>
-        <w:tc>
-          <w:tcPr>
-            <w:tcW w:w="2337" w:type="dxa"/>
-          </w:tcPr>
-          <w:p>
-            <w:pPr>
-              <w:cnfStyle w:val="000000100000" w:firstRow="0" w:lastRow="0" w:firstColumn="0" w:lastColumn="0" w:oddVBand="0" w:evenVBand="0" w:oddHBand="1" w:evenHBand="0" w:firstRowFirstColumn="0" w:firstRowLastColumn="0" w:lastRowFirstColumn="0" w:lastRowLastColumn="0"/>
-            </w:pPr>
-            <w:r>
-              <w:t>Explanation containing calculation details</w:t>
-            </w:r>
-          </w:p>
-        </w:tc>
-        <w:tc>
-          <w:tcPr>
-            <w:tcW w:w="2338" w:type="dxa"/>
-          </w:tcPr>
-          <w:p>
-            <w:pPr>
-              <w:cnfStyle w:val="000000100000" w:firstRow="0" w:lastRow="0" w:firstColumn="0" w:lastColumn="0" w:oddVBand="0" w:evenVBand="0" w:oddHBand="1" w:evenHBand="0" w:firstRowFirstColumn="0" w:firstRowLastColumn="0" w:lastRowFirstColumn="0" w:lastRowLastColumn="0"/>
-            </w:pPr>
-            <w:r>
-              <w:t>Optional, audit trail.</w:t>
-            </w:r>
-          </w:p>
-        </w:tc>
-      </w:tr>
-    </w:tbl>
-    <w:p>
-      <w:pPr>
-        <w:rPr>
-          <w:b/>
-        </w:rPr>
-      </w:pPr>
-    </w:p>
-    <w:p>
-      <w:pPr>
-        <w:rPr>
-          <w:b/>
-        </w:rPr>
-      </w:pPr>
-    </w:p>
-    <w:p>
-      <w:pPr>
-        <w:ind w:left="2160"/>
-        <w:rPr>
-          <w:b/>
-          <w:sz w:val="28"/>
-          <w:szCs w:val="28"/>
-        </w:rPr>
-      </w:pPr>
-    </w:p>
-    <w:p>
-      <w:pPr>
-        <w:ind w:left="2160"/>
-      </w:pPr>
-    </w:p>
-    <w:p>
-      <w:pPr>
-        <w:ind w:left="2160"/>
-      </w:pPr>
-    </w:p>
-    <w:p>
-      <w:pPr>
-        <w:ind w:left="2160"/>
-      </w:pPr>
-    </w:p>
-    <w:p>
-      <w:pPr>
-        <w:ind w:left="2160"/>
-      </w:pPr>
-    </w:p>
-    <w:p>
-      <w:pPr>
-        <w:ind w:left="2160"/>
-      </w:pPr>
-    </w:p>
-    <w:p>
-      <w:pPr>
-        <w:ind w:left="2160"/>
-      </w:pPr>
-    </w:p>
-    <w:p>
-      <w:pPr>
-        <w:ind w:left="2160"/>
-      </w:pPr>
-    </w:p>
-    <w:p>
-      <w:pPr>
-        <w:ind w:left="2160"/>
-      </w:pPr>
-    </w:p>
-    <w:p>
-      <w:pPr>
-        <w:ind w:left="2160"/>
-      </w:pPr>
-    </w:p>
-    <w:p>
-      <w:pPr>
-        <w:ind w:left="2160"/>
-      </w:pPr>
-    </w:p>
-    <w:p>
-      <w:pPr>
-        <w:ind w:left="2160"/>
-      </w:pPr>
-    </w:p>
-    <w:p>
-      <w:pPr>
-        <w:ind w:left="2160"/>
-      </w:pPr>
-    </w:p>
-    <w:p>
-      <w:pPr>
-        <w:ind w:left="2160"/>
-      </w:pPr>
-    </w:p>
-    <w:p>
-      <w:pPr>
-        <w:ind w:left="2160"/>
-      </w:pPr>
-    </w:p>
-    <w:p>
-      <w:pPr>
-        <w:ind w:left="2160"/>
-      </w:pPr>
-    </w:p>
-    <w:p>
-      <w:pPr>
-        <w:ind w:left="2160"/>
-      </w:pPr>
-    </w:p>
-    <w:p>
-      <w:pPr>
-        <w:ind w:left="2160"/>
-      </w:pPr>
-    </w:p>
-    <w:p>
-      <w:pPr>
-        <w:ind w:left="2160"/>
-      </w:pPr>
-    </w:p>
-    <w:p>
-      <w:pPr>
-        <w:numPr>
-          <w:ilvl w:val="1"/>
-          <w:numId w:val="32"/>
-        </w:numPr>
-        <w:rPr>
-          <w:b/>
-          <w:sz w:val="28"/>
-          <w:szCs w:val="28"/>
-        </w:rPr>
-      </w:pPr>
-      <w:r>
-        <w:rPr>
-          <w:b/>
-          <w:sz w:val="28"/>
-          <w:szCs w:val="28"/>
-        </w:rPr>
-        <w:lastRenderedPageBreak/>
-        <w:t>Appendix C: List of Inputs &amp; Outputs</w:t>
+        <w:t>Appendix A</w:t>
+      </w:r>
+      <w:r>
+        <w:rPr>
+          <w:b/>
+          <w:sz w:val="28"/>
+          <w:szCs w:val="28"/>
+        </w:rPr>
+        <w:t>: List of Inputs &amp; Outputs</w:t>
       </w:r>
     </w:p>
     <w:p>
@@ -8605,6 +6592,7 @@
               <w:widowControl w:val="0"/>
             </w:pPr>
             <w:r>
+              <w:lastRenderedPageBreak/>
               <w:t>I-5</w:t>
             </w:r>
           </w:p>
@@ -8689,105 +6677,6 @@
     </w:p>
     <w:p>
       <w:pPr>
-        <w:rPr>
-          <w:b/>
-          <w:sz w:val="28"/>
-          <w:szCs w:val="28"/>
-        </w:rPr>
-      </w:pPr>
-    </w:p>
-    <w:p>
-      <w:pPr>
-        <w:rPr>
-          <w:b/>
-          <w:sz w:val="28"/>
-          <w:szCs w:val="28"/>
-        </w:rPr>
-      </w:pPr>
-    </w:p>
-    <w:p>
-      <w:pPr>
-        <w:rPr>
-          <w:b/>
-          <w:sz w:val="28"/>
-          <w:szCs w:val="28"/>
-        </w:rPr>
-      </w:pPr>
-    </w:p>
-    <w:p>
-      <w:pPr>
-        <w:rPr>
-          <w:b/>
-          <w:sz w:val="28"/>
-          <w:szCs w:val="28"/>
-        </w:rPr>
-      </w:pPr>
-    </w:p>
-    <w:p>
-      <w:pPr>
-        <w:rPr>
-          <w:b/>
-          <w:sz w:val="28"/>
-          <w:szCs w:val="28"/>
-        </w:rPr>
-      </w:pPr>
-    </w:p>
-    <w:p>
-      <w:pPr>
-        <w:rPr>
-          <w:b/>
-          <w:sz w:val="28"/>
-          <w:szCs w:val="28"/>
-        </w:rPr>
-      </w:pPr>
-    </w:p>
-    <w:p>
-      <w:pPr>
-        <w:rPr>
-          <w:b/>
-          <w:sz w:val="28"/>
-          <w:szCs w:val="28"/>
-        </w:rPr>
-      </w:pPr>
-    </w:p>
-    <w:p>
-      <w:pPr>
-        <w:rPr>
-          <w:b/>
-          <w:sz w:val="28"/>
-          <w:szCs w:val="28"/>
-        </w:rPr>
-      </w:pPr>
-    </w:p>
-    <w:p>
-      <w:pPr>
-        <w:rPr>
-          <w:b/>
-          <w:sz w:val="28"/>
-          <w:szCs w:val="28"/>
-        </w:rPr>
-      </w:pPr>
-    </w:p>
-    <w:p>
-      <w:pPr>
-        <w:rPr>
-          <w:b/>
-          <w:sz w:val="28"/>
-          <w:szCs w:val="28"/>
-        </w:rPr>
-      </w:pPr>
-    </w:p>
-    <w:p>
-      <w:pPr>
-        <w:rPr>
-          <w:b/>
-          <w:sz w:val="28"/>
-          <w:szCs w:val="28"/>
-        </w:rPr>
-      </w:pPr>
-    </w:p>
-    <w:p>
-      <w:pPr>
         <w:numPr>
           <w:ilvl w:val="2"/>
           <w:numId w:val="32"/>
@@ -8804,7 +6693,6 @@
           <w:sz w:val="28"/>
           <w:szCs w:val="28"/>
         </w:rPr>
-        <w:lastRenderedPageBreak/>
         <w:t>Output</w:t>
       </w:r>
     </w:p>
@@ -9067,7 +6955,12 @@
               </w:pBdr>
             </w:pPr>
             <w:r>
-              <w:t>A breakdown showing which purchase lot each sale corresponds to and the indexing factor applied.</w:t>
+              <w:t xml:space="preserve">A breakdown showing </w:t>
+            </w:r>
+            <w:bookmarkStart w:id="9" w:name="_GoBack"/>
+            <w:bookmarkEnd w:id="9"/>
+            <w:r>
+              <w:t>which purchase lot each sale corresponds to and the indexing factor applied.</w:t>
             </w:r>
           </w:p>
         </w:tc>
@@ -14264,7 +12157,7 @@
 </file>
 
 <file path=customXml/itemProps1.xml><?xml version="1.0" encoding="utf-8"?>
-<ds:datastoreItem xmlns:ds="http://schemas.openxmlformats.org/officeDocument/2006/customXml" ds:itemID="{399359BB-F1AB-4B43-B639-735F4EDF953C}">
+<ds:datastoreItem xmlns:ds="http://schemas.openxmlformats.org/officeDocument/2006/customXml" ds:itemID="{34BF1AB3-456A-46A7-BC67-EE00246B6720}">
   <ds:schemaRefs>
     <ds:schemaRef ds:uri="http://schemas.openxmlformats.org/officeDocument/2006/bibliography"/>
   </ds:schemaRefs>

</xml_diff>